<commit_message>
Update file phan cong
</commit_message>
<xml_diff>
--- a/DOCX/phân công.docx
+++ b/DOCX/phân công.docx
@@ -4,6 +4,7 @@
   <w:body>
     <w:tbl>
       <w:tblPr>
+        <w:tblStyle w:val="3"/>
         <w:tblW w:w="9684" w:type="dxa"/>
         <w:tblInd w:w="-848" w:type="dxa"/>
         <w:tblBorders>
@@ -14,7 +15,7 @@
           <w:insideH w:val="outset" w:color="auto" w:sz="6" w:space="0"/>
           <w:insideV w:val="outset" w:color="auto" w:sz="6" w:space="0"/>
         </w:tblBorders>
-        <w:shd w:val="clear"/>
+        <w:shd w:val="clear" w:color="auto" w:fill="auto"/>
         <w:tblLayout w:type="autofit"/>
         <w:tblCellMar>
           <w:top w:w="0" w:type="dxa"/>
@@ -38,7 +39,7 @@
             <w:insideH w:val="outset" w:color="auto" w:sz="6" w:space="0"/>
             <w:insideV w:val="outset" w:color="auto" w:sz="6" w:space="0"/>
           </w:tblBorders>
-          <w:shd w:val="clear"/>
+          <w:shd w:val="clear" w:color="auto" w:fill="auto"/>
           <w:tblCellMar>
             <w:top w:w="0" w:type="dxa"/>
             <w:left w:w="0" w:type="dxa"/>
@@ -90,7 +91,6 @@
                 <w:kern w:val="0"/>
                 <w:sz w:val="26"/>
                 <w:szCs w:val="26"/>
-                <w:bdr w:val="none" w:color="auto" w:sz="0" w:space="0"/>
                 <w:lang w:val="en-US" w:eastAsia="zh-CN" w:bidi="ar"/>
               </w:rPr>
               <w:t>Họ và Tên</w:t>
@@ -138,7 +138,6 @@
                 <w:kern w:val="0"/>
                 <w:sz w:val="26"/>
                 <w:szCs w:val="26"/>
-                <w:bdr w:val="none" w:color="auto" w:sz="0" w:space="0"/>
                 <w:lang w:val="en-US" w:eastAsia="zh-CN" w:bidi="ar"/>
               </w:rPr>
               <w:t xml:space="preserve">Vai trò </w:t>
@@ -186,7 +185,6 @@
                 <w:kern w:val="0"/>
                 <w:sz w:val="26"/>
                 <w:szCs w:val="26"/>
-                <w:bdr w:val="none" w:color="auto" w:sz="0" w:space="0"/>
                 <w:lang w:val="en-US" w:eastAsia="zh-CN" w:bidi="ar"/>
               </w:rPr>
               <w:t>Modul</w:t>
@@ -204,7 +202,7 @@
             <w:insideH w:val="outset" w:color="auto" w:sz="6" w:space="0"/>
             <w:insideV w:val="outset" w:color="auto" w:sz="6" w:space="0"/>
           </w:tblBorders>
-          <w:shd w:val="clear"/>
+          <w:shd w:val="clear" w:color="auto" w:fill="auto"/>
           <w:tblCellMar>
             <w:top w:w="0" w:type="dxa"/>
             <w:left w:w="0" w:type="dxa"/>
@@ -224,7 +222,7 @@
               <w:bottom w:val="single" w:color="CCCCCC" w:sz="4" w:space="0"/>
               <w:right w:val="single" w:color="CCCCCC" w:sz="4" w:space="0"/>
             </w:tcBorders>
-            <w:shd w:val="clear"/>
+            <w:shd w:val="clear" w:color="auto" w:fill="auto"/>
             <w:tcMar>
               <w:top w:w="30" w:type="dxa"/>
               <w:left w:w="45" w:type="dxa"/>
@@ -256,7 +254,6 @@
                 <w:kern w:val="0"/>
                 <w:sz w:val="26"/>
                 <w:szCs w:val="26"/>
-                <w:bdr w:val="none" w:color="auto" w:sz="0" w:space="0"/>
                 <w:lang w:val="en-US" w:eastAsia="zh-CN" w:bidi="ar"/>
               </w:rPr>
               <w:t xml:space="preserve">Huỳnh Văn Tại </w:t>
@@ -272,7 +269,7 @@
               <w:bottom w:val="single" w:color="CCCCCC" w:sz="4" w:space="0"/>
               <w:right w:val="single" w:color="CCCCCC" w:sz="4" w:space="0"/>
             </w:tcBorders>
-            <w:shd w:val="clear"/>
+            <w:shd w:val="clear" w:color="auto" w:fill="auto"/>
             <w:tcMar>
               <w:top w:w="30" w:type="dxa"/>
               <w:left w:w="45" w:type="dxa"/>
@@ -302,7 +299,6 @@
                 <w:kern w:val="0"/>
                 <w:sz w:val="26"/>
                 <w:szCs w:val="26"/>
-                <w:bdr w:val="none" w:color="auto" w:sz="0" w:space="0"/>
                 <w:lang w:val="en-US" w:eastAsia="zh-CN" w:bidi="ar"/>
               </w:rPr>
               <w:t>Team Lead + Architect</w:t>
@@ -318,7 +314,7 @@
               <w:bottom w:val="single" w:color="CCCCCC" w:sz="4" w:space="0"/>
               <w:right w:val="single" w:color="CCCCCC" w:sz="4" w:space="0"/>
             </w:tcBorders>
-            <w:shd w:val="clear"/>
+            <w:shd w:val="clear" w:color="auto" w:fill="auto"/>
             <w:tcMar>
               <w:top w:w="30" w:type="dxa"/>
               <w:left w:w="45" w:type="dxa"/>
@@ -348,7 +344,6 @@
                 <w:kern w:val="0"/>
                 <w:sz w:val="26"/>
                 <w:szCs w:val="26"/>
-                <w:bdr w:val="none" w:color="auto" w:sz="0" w:space="0"/>
                 <w:lang w:val="en-US" w:eastAsia="zh-CN" w:bidi="ar"/>
               </w:rPr>
               <w:t>Core Socket TCP (QTcpSocket/QTcpServer)</w:t>
@@ -366,7 +361,7 @@
             <w:insideH w:val="outset" w:color="auto" w:sz="6" w:space="0"/>
             <w:insideV w:val="outset" w:color="auto" w:sz="6" w:space="0"/>
           </w:tblBorders>
-          <w:shd w:val="clear"/>
+          <w:shd w:val="clear" w:color="auto" w:fill="auto"/>
           <w:tblCellMar>
             <w:top w:w="0" w:type="dxa"/>
             <w:left w:w="0" w:type="dxa"/>
@@ -386,7 +381,7 @@
               <w:bottom w:val="single" w:color="CCCCCC" w:sz="4" w:space="0"/>
               <w:right w:val="single" w:color="CCCCCC" w:sz="4" w:space="0"/>
             </w:tcBorders>
-            <w:shd w:val="clear"/>
+            <w:shd w:val="clear" w:color="auto" w:fill="auto"/>
             <w:tcMar>
               <w:top w:w="30" w:type="dxa"/>
               <w:left w:w="45" w:type="dxa"/>
@@ -416,7 +411,6 @@
                 <w:kern w:val="0"/>
                 <w:sz w:val="26"/>
                 <w:szCs w:val="26"/>
-                <w:bdr w:val="none" w:color="auto" w:sz="0" w:space="0"/>
                 <w:lang w:val="en-US" w:eastAsia="zh-CN" w:bidi="ar"/>
               </w:rPr>
               <w:t>Ngô Đặng Minh Khôi</w:t>
@@ -432,7 +426,7 @@
               <w:bottom w:val="single" w:color="CCCCCC" w:sz="4" w:space="0"/>
               <w:right w:val="single" w:color="CCCCCC" w:sz="4" w:space="0"/>
             </w:tcBorders>
-            <w:shd w:val="clear"/>
+            <w:shd w:val="clear" w:color="auto" w:fill="auto"/>
             <w:tcMar>
               <w:top w:w="30" w:type="dxa"/>
               <w:left w:w="45" w:type="dxa"/>
@@ -462,7 +456,6 @@
                 <w:kern w:val="0"/>
                 <w:sz w:val="26"/>
                 <w:szCs w:val="26"/>
-                <w:bdr w:val="none" w:color="auto" w:sz="0" w:space="0"/>
                 <w:lang w:val="en-US" w:eastAsia="zh-CN" w:bidi="ar"/>
               </w:rPr>
               <w:t>Developer</w:t>
@@ -478,7 +471,7 @@
               <w:bottom w:val="single" w:color="CCCCCC" w:sz="4" w:space="0"/>
               <w:right w:val="single" w:color="CCCCCC" w:sz="4" w:space="0"/>
             </w:tcBorders>
-            <w:shd w:val="clear"/>
+            <w:shd w:val="clear" w:color="auto" w:fill="auto"/>
             <w:tcMar>
               <w:top w:w="30" w:type="dxa"/>
               <w:left w:w="45" w:type="dxa"/>
@@ -508,7 +501,6 @@
                 <w:kern w:val="0"/>
                 <w:sz w:val="26"/>
                 <w:szCs w:val="26"/>
-                <w:bdr w:val="none" w:color="auto" w:sz="0" w:space="0"/>
                 <w:lang w:val="en-US" w:eastAsia="zh-CN" w:bidi="ar"/>
               </w:rPr>
               <w:t>Peer Discovery UDP</w:t>
@@ -526,7 +518,7 @@
             <w:insideH w:val="outset" w:color="auto" w:sz="6" w:space="0"/>
             <w:insideV w:val="outset" w:color="auto" w:sz="6" w:space="0"/>
           </w:tblBorders>
-          <w:shd w:val="clear"/>
+          <w:shd w:val="clear" w:color="auto" w:fill="auto"/>
           <w:tblCellMar>
             <w:top w:w="0" w:type="dxa"/>
             <w:left w:w="0" w:type="dxa"/>
@@ -546,7 +538,7 @@
               <w:bottom w:val="single" w:color="CCCCCC" w:sz="4" w:space="0"/>
               <w:right w:val="single" w:color="CCCCCC" w:sz="4" w:space="0"/>
             </w:tcBorders>
-            <w:shd w:val="clear"/>
+            <w:shd w:val="clear" w:color="auto" w:fill="auto"/>
             <w:tcMar>
               <w:top w:w="30" w:type="dxa"/>
               <w:left w:w="45" w:type="dxa"/>
@@ -576,7 +568,6 @@
                 <w:kern w:val="0"/>
                 <w:sz w:val="26"/>
                 <w:szCs w:val="26"/>
-                <w:bdr w:val="none" w:color="auto" w:sz="0" w:space="0"/>
                 <w:lang w:val="en-US" w:eastAsia="zh-CN" w:bidi="ar"/>
               </w:rPr>
               <w:t>Trần Ngô Duy Khang</w:t>
@@ -592,7 +583,7 @@
               <w:bottom w:val="single" w:color="CCCCCC" w:sz="4" w:space="0"/>
               <w:right w:val="single" w:color="CCCCCC" w:sz="4" w:space="0"/>
             </w:tcBorders>
-            <w:shd w:val="clear"/>
+            <w:shd w:val="clear" w:color="auto" w:fill="auto"/>
             <w:tcMar>
               <w:top w:w="30" w:type="dxa"/>
               <w:left w:w="45" w:type="dxa"/>
@@ -622,7 +613,6 @@
                 <w:kern w:val="0"/>
                 <w:sz w:val="26"/>
                 <w:szCs w:val="26"/>
-                <w:bdr w:val="none" w:color="auto" w:sz="0" w:space="0"/>
                 <w:lang w:val="en-US" w:eastAsia="zh-CN" w:bidi="ar"/>
               </w:rPr>
               <w:t>GUI Developer</w:t>
@@ -638,7 +628,7 @@
               <w:bottom w:val="single" w:color="CCCCCC" w:sz="4" w:space="0"/>
               <w:right w:val="single" w:color="CCCCCC" w:sz="4" w:space="0"/>
             </w:tcBorders>
-            <w:shd w:val="clear"/>
+            <w:shd w:val="clear" w:color="auto" w:fill="auto"/>
             <w:tcMar>
               <w:top w:w="30" w:type="dxa"/>
               <w:left w:w="45" w:type="dxa"/>
@@ -668,7 +658,6 @@
                 <w:kern w:val="0"/>
                 <w:sz w:val="26"/>
                 <w:szCs w:val="26"/>
-                <w:bdr w:val="none" w:color="auto" w:sz="0" w:space="0"/>
                 <w:lang w:val="en-US" w:eastAsia="zh-CN" w:bidi="ar"/>
               </w:rPr>
               <w:t>Main Window &amp; Navigation</w:t>
@@ -686,7 +675,7 @@
             <w:insideH w:val="outset" w:color="auto" w:sz="6" w:space="0"/>
             <w:insideV w:val="outset" w:color="auto" w:sz="6" w:space="0"/>
           </w:tblBorders>
-          <w:shd w:val="clear"/>
+          <w:shd w:val="clear" w:color="auto" w:fill="auto"/>
           <w:tblCellMar>
             <w:top w:w="0" w:type="dxa"/>
             <w:left w:w="0" w:type="dxa"/>
@@ -706,7 +695,7 @@
               <w:bottom w:val="single" w:color="CCCCCC" w:sz="4" w:space="0"/>
               <w:right w:val="single" w:color="CCCCCC" w:sz="4" w:space="0"/>
             </w:tcBorders>
-            <w:shd w:val="clear"/>
+            <w:shd w:val="clear" w:color="auto" w:fill="auto"/>
             <w:tcMar>
               <w:top w:w="30" w:type="dxa"/>
               <w:left w:w="45" w:type="dxa"/>
@@ -736,7 +725,6 @@
                 <w:kern w:val="0"/>
                 <w:sz w:val="26"/>
                 <w:szCs w:val="26"/>
-                <w:bdr w:val="none" w:color="auto" w:sz="0" w:space="0"/>
                 <w:lang w:val="en-US" w:eastAsia="zh-CN" w:bidi="ar"/>
               </w:rPr>
               <w:t>Ngủ Hoàng Khang</w:t>
@@ -752,7 +740,7 @@
               <w:bottom w:val="single" w:color="CCCCCC" w:sz="4" w:space="0"/>
               <w:right w:val="single" w:color="CCCCCC" w:sz="4" w:space="0"/>
             </w:tcBorders>
-            <w:shd w:val="clear"/>
+            <w:shd w:val="clear" w:color="auto" w:fill="auto"/>
             <w:tcMar>
               <w:top w:w="30" w:type="dxa"/>
               <w:left w:w="45" w:type="dxa"/>
@@ -782,7 +770,6 @@
                 <w:kern w:val="0"/>
                 <w:sz w:val="26"/>
                 <w:szCs w:val="26"/>
-                <w:bdr w:val="none" w:color="auto" w:sz="0" w:space="0"/>
                 <w:lang w:val="en-US" w:eastAsia="zh-CN" w:bidi="ar"/>
               </w:rPr>
               <w:t>Network Developer</w:t>
@@ -798,7 +785,7 @@
               <w:bottom w:val="single" w:color="CCCCCC" w:sz="4" w:space="0"/>
               <w:right w:val="single" w:color="CCCCCC" w:sz="4" w:space="0"/>
             </w:tcBorders>
-            <w:shd w:val="clear"/>
+            <w:shd w:val="clear" w:color="auto" w:fill="auto"/>
             <w:tcMar>
               <w:top w:w="30" w:type="dxa"/>
               <w:left w:w="45" w:type="dxa"/>
@@ -828,7 +815,6 @@
                 <w:kern w:val="0"/>
                 <w:sz w:val="26"/>
                 <w:szCs w:val="26"/>
-                <w:bdr w:val="none" w:color="auto" w:sz="0" w:space="0"/>
                 <w:lang w:val="en-US" w:eastAsia="zh-CN" w:bidi="ar"/>
               </w:rPr>
               <w:t>Chat Realtime</w:t>
@@ -846,7 +832,7 @@
             <w:insideH w:val="outset" w:color="auto" w:sz="6" w:space="0"/>
             <w:insideV w:val="outset" w:color="auto" w:sz="6" w:space="0"/>
           </w:tblBorders>
-          <w:shd w:val="clear"/>
+          <w:shd w:val="clear" w:color="auto" w:fill="auto"/>
           <w:tblCellMar>
             <w:top w:w="0" w:type="dxa"/>
             <w:left w:w="0" w:type="dxa"/>
@@ -866,7 +852,7 @@
               <w:bottom w:val="single" w:color="CCCCCC" w:sz="4" w:space="0"/>
               <w:right w:val="single" w:color="CCCCCC" w:sz="4" w:space="0"/>
             </w:tcBorders>
-            <w:shd w:val="clear"/>
+            <w:shd w:val="clear" w:color="auto" w:fill="auto"/>
             <w:tcMar>
               <w:top w:w="30" w:type="dxa"/>
               <w:left w:w="45" w:type="dxa"/>
@@ -896,7 +882,6 @@
                 <w:kern w:val="0"/>
                 <w:sz w:val="26"/>
                 <w:szCs w:val="26"/>
-                <w:bdr w:val="none" w:color="auto" w:sz="0" w:space="0"/>
                 <w:lang w:val="en-US" w:eastAsia="zh-CN" w:bidi="ar"/>
               </w:rPr>
               <w:t>Nguyễn Thanh Khánh</w:t>
@@ -912,7 +897,7 @@
               <w:bottom w:val="single" w:color="CCCCCC" w:sz="4" w:space="0"/>
               <w:right w:val="single" w:color="CCCCCC" w:sz="4" w:space="0"/>
             </w:tcBorders>
-            <w:shd w:val="clear"/>
+            <w:shd w:val="clear" w:color="auto" w:fill="auto"/>
             <w:tcMar>
               <w:top w:w="30" w:type="dxa"/>
               <w:left w:w="45" w:type="dxa"/>
@@ -942,7 +927,6 @@
                 <w:kern w:val="0"/>
                 <w:sz w:val="26"/>
                 <w:szCs w:val="26"/>
-                <w:bdr w:val="none" w:color="auto" w:sz="0" w:space="0"/>
                 <w:lang w:val="en-US" w:eastAsia="zh-CN" w:bidi="ar"/>
               </w:rPr>
               <w:t>File Transfer Developer</w:t>
@@ -958,7 +942,7 @@
               <w:bottom w:val="single" w:color="CCCCCC" w:sz="4" w:space="0"/>
               <w:right w:val="single" w:color="CCCCCC" w:sz="4" w:space="0"/>
             </w:tcBorders>
-            <w:shd w:val="clear"/>
+            <w:shd w:val="clear" w:color="auto" w:fill="auto"/>
             <w:tcMar>
               <w:top w:w="30" w:type="dxa"/>
               <w:left w:w="45" w:type="dxa"/>
@@ -988,7 +972,6 @@
                 <w:kern w:val="0"/>
                 <w:sz w:val="26"/>
                 <w:szCs w:val="26"/>
-                <w:bdr w:val="none" w:color="auto" w:sz="0" w:space="0"/>
                 <w:lang w:val="en-US" w:eastAsia="zh-CN" w:bidi="ar"/>
               </w:rPr>
               <w:t>File Transfer</w:t>
@@ -1006,7 +989,7 @@
             <w:insideH w:val="outset" w:color="auto" w:sz="6" w:space="0"/>
             <w:insideV w:val="outset" w:color="auto" w:sz="6" w:space="0"/>
           </w:tblBorders>
-          <w:shd w:val="clear"/>
+          <w:shd w:val="clear" w:color="auto" w:fill="auto"/>
           <w:tblCellMar>
             <w:top w:w="0" w:type="dxa"/>
             <w:left w:w="0" w:type="dxa"/>
@@ -1026,7 +1009,7 @@
               <w:bottom w:val="single" w:color="CCCCCC" w:sz="4" w:space="0"/>
               <w:right w:val="single" w:color="CCCCCC" w:sz="4" w:space="0"/>
             </w:tcBorders>
-            <w:shd w:val="clear"/>
+            <w:shd w:val="clear" w:color="auto" w:fill="auto"/>
             <w:tcMar>
               <w:top w:w="30" w:type="dxa"/>
               <w:left w:w="45" w:type="dxa"/>
@@ -1056,7 +1039,6 @@
                 <w:kern w:val="0"/>
                 <w:sz w:val="26"/>
                 <w:szCs w:val="26"/>
-                <w:bdr w:val="none" w:color="auto" w:sz="0" w:space="0"/>
                 <w:lang w:val="en-US" w:eastAsia="zh-CN" w:bidi="ar"/>
               </w:rPr>
               <w:t>Lương Quốc Khánh</w:t>
@@ -1072,7 +1054,7 @@
               <w:bottom w:val="single" w:color="CCCCCC" w:sz="4" w:space="0"/>
               <w:right w:val="single" w:color="CCCCCC" w:sz="4" w:space="0"/>
             </w:tcBorders>
-            <w:shd w:val="clear"/>
+            <w:shd w:val="clear" w:color="auto" w:fill="auto"/>
             <w:tcMar>
               <w:top w:w="30" w:type="dxa"/>
               <w:left w:w="45" w:type="dxa"/>
@@ -1102,7 +1084,6 @@
                 <w:kern w:val="0"/>
                 <w:sz w:val="26"/>
                 <w:szCs w:val="26"/>
-                <w:bdr w:val="none" w:color="auto" w:sz="0" w:space="0"/>
                 <w:lang w:val="en-US" w:eastAsia="zh-CN" w:bidi="ar"/>
               </w:rPr>
               <w:t>System Developer</w:t>
@@ -1118,7 +1099,7 @@
               <w:bottom w:val="single" w:color="CCCCCC" w:sz="4" w:space="0"/>
               <w:right w:val="single" w:color="CCCCCC" w:sz="4" w:space="0"/>
             </w:tcBorders>
-            <w:shd w:val="clear"/>
+            <w:shd w:val="clear" w:color="auto" w:fill="auto"/>
             <w:tcMar>
               <w:top w:w="30" w:type="dxa"/>
               <w:left w:w="45" w:type="dxa"/>
@@ -1148,7 +1129,6 @@
                 <w:kern w:val="0"/>
                 <w:sz w:val="26"/>
                 <w:szCs w:val="26"/>
-                <w:bdr w:val="none" w:color="auto" w:sz="0" w:space="0"/>
                 <w:lang w:val="en-US" w:eastAsia="zh-CN" w:bidi="ar"/>
               </w:rPr>
               <w:t>Peer Management</w:t>
@@ -1167,6 +1147,7 @@
     </w:p>
     <w:tbl>
       <w:tblPr>
+        <w:tblStyle w:val="3"/>
         <w:tblW w:w="10476" w:type="dxa"/>
         <w:tblInd w:w="-1376" w:type="dxa"/>
         <w:tblBorders>
@@ -1177,7 +1158,7 @@
           <w:insideH w:val="outset" w:color="auto" w:sz="6" w:space="0"/>
           <w:insideV w:val="outset" w:color="auto" w:sz="6" w:space="0"/>
         </w:tblBorders>
-        <w:shd w:val="clear"/>
+        <w:shd w:val="clear" w:color="auto" w:fill="auto"/>
         <w:tblLayout w:type="autofit"/>
         <w:tblCellMar>
           <w:top w:w="0" w:type="dxa"/>
@@ -1200,7 +1181,7 @@
             <w:insideH w:val="outset" w:color="auto" w:sz="6" w:space="0"/>
             <w:insideV w:val="outset" w:color="auto" w:sz="6" w:space="0"/>
           </w:tblBorders>
-          <w:shd w:val="clear"/>
+          <w:shd w:val="clear" w:color="auto" w:fill="auto"/>
           <w:tblCellMar>
             <w:top w:w="0" w:type="dxa"/>
             <w:left w:w="0" w:type="dxa"/>
@@ -1220,7 +1201,7 @@
               <w:bottom w:val="single" w:color="CCCCCC" w:sz="4" w:space="0"/>
               <w:right w:val="single" w:color="CCCCCC" w:sz="4" w:space="0"/>
             </w:tcBorders>
-            <w:shd w:val="clear"/>
+            <w:shd w:val="clear" w:color="auto" w:fill="auto"/>
             <w:tcMar>
               <w:top w:w="30" w:type="dxa"/>
               <w:left w:w="45" w:type="dxa"/>
@@ -1250,7 +1231,6 @@
                 <w:kern w:val="0"/>
                 <w:sz w:val="26"/>
                 <w:szCs w:val="26"/>
-                <w:bdr w:val="none" w:color="auto" w:sz="0" w:space="0"/>
                 <w:lang w:val="en-US" w:eastAsia="zh-CN" w:bidi="ar"/>
               </w:rPr>
               <w:t xml:space="preserve">TÊN </w:t>
@@ -1266,7 +1246,7 @@
               <w:bottom w:val="single" w:color="CCCCCC" w:sz="4" w:space="0"/>
               <w:right w:val="single" w:color="CCCCCC" w:sz="4" w:space="0"/>
             </w:tcBorders>
-            <w:shd w:val="clear"/>
+            <w:shd w:val="clear" w:color="auto" w:fill="auto"/>
             <w:tcMar>
               <w:top w:w="30" w:type="dxa"/>
               <w:left w:w="45" w:type="dxa"/>
@@ -1296,7 +1276,6 @@
                 <w:kern w:val="0"/>
                 <w:sz w:val="26"/>
                 <w:szCs w:val="26"/>
-                <w:bdr w:val="none" w:color="auto" w:sz="0" w:space="0"/>
                 <w:lang w:val="en-US" w:eastAsia="zh-CN" w:bidi="ar"/>
               </w:rPr>
               <w:t>TUẦN 1</w:t>
@@ -1314,7 +1293,6 @@
             <w:insideH w:val="outset" w:color="auto" w:sz="6" w:space="0"/>
             <w:insideV w:val="outset" w:color="auto" w:sz="6" w:space="0"/>
           </w:tblBorders>
-          <w:shd w:val="clear"/>
           <w:tblCellMar>
             <w:top w:w="0" w:type="dxa"/>
             <w:left w:w="0" w:type="dxa"/>
@@ -1334,7 +1312,7 @@
               <w:bottom w:val="single" w:color="CCCCCC" w:sz="4" w:space="0"/>
               <w:right w:val="single" w:color="CCCCCC" w:sz="4" w:space="0"/>
             </w:tcBorders>
-            <w:shd w:val="clear"/>
+            <w:shd w:val="clear" w:color="auto" w:fill="auto"/>
             <w:tcMar>
               <w:top w:w="30" w:type="dxa"/>
               <w:left w:w="45" w:type="dxa"/>
@@ -1366,7 +1344,6 @@
                 <w:kern w:val="0"/>
                 <w:sz w:val="26"/>
                 <w:szCs w:val="26"/>
-                <w:bdr w:val="none" w:color="auto" w:sz="0" w:space="0"/>
                 <w:lang w:val="en-US" w:eastAsia="zh-CN" w:bidi="ar"/>
               </w:rPr>
               <w:t xml:space="preserve">Huỳnh Văn Tại </w:t>
@@ -1382,7 +1359,7 @@
               <w:bottom w:val="single" w:color="CCCCCC" w:sz="4" w:space="0"/>
               <w:right w:val="single" w:color="CCCCCC" w:sz="4" w:space="0"/>
             </w:tcBorders>
-            <w:shd w:val="clear"/>
+            <w:shd w:val="clear" w:color="auto" w:fill="auto"/>
             <w:tcMar>
               <w:top w:w="30" w:type="dxa"/>
               <w:left w:w="45" w:type="dxa"/>
@@ -1412,7 +1389,6 @@
                 <w:kern w:val="0"/>
                 <w:sz w:val="26"/>
                 <w:szCs w:val="26"/>
-                <w:bdr w:val="none" w:color="auto" w:sz="0" w:space="0"/>
                 <w:lang w:val="en-US" w:eastAsia="zh-CN" w:bidi="ar"/>
               </w:rPr>
               <w:t>Thiết kế và xây dựng TCP Server/Client, quy trình Handshake (HANDSHAKE, HANDSHAKE_ACK, SESSION_KEY), xây dựng kiến trúc Project, review code và tích hợp module.</w:t>
@@ -1430,7 +1406,7 @@
             <w:insideH w:val="outset" w:color="auto" w:sz="6" w:space="0"/>
             <w:insideV w:val="outset" w:color="auto" w:sz="6" w:space="0"/>
           </w:tblBorders>
-          <w:shd w:val="clear"/>
+          <w:shd w:val="clear" w:color="auto" w:fill="auto"/>
           <w:tblCellMar>
             <w:top w:w="0" w:type="dxa"/>
             <w:left w:w="0" w:type="dxa"/>
@@ -1450,7 +1426,7 @@
               <w:bottom w:val="single" w:color="CCCCCC" w:sz="4" w:space="0"/>
               <w:right w:val="single" w:color="CCCCCC" w:sz="4" w:space="0"/>
             </w:tcBorders>
-            <w:shd w:val="clear"/>
+            <w:shd w:val="clear" w:color="auto" w:fill="auto"/>
             <w:tcMar>
               <w:top w:w="30" w:type="dxa"/>
               <w:left w:w="45" w:type="dxa"/>
@@ -1480,7 +1456,6 @@
                 <w:kern w:val="0"/>
                 <w:sz w:val="26"/>
                 <w:szCs w:val="26"/>
-                <w:bdr w:val="none" w:color="auto" w:sz="0" w:space="0"/>
                 <w:lang w:val="en-US" w:eastAsia="zh-CN" w:bidi="ar"/>
               </w:rPr>
               <w:t>Ngô Đặng Minh Khôi</w:t>
@@ -1496,7 +1471,7 @@
               <w:bottom w:val="single" w:color="CCCCCC" w:sz="4" w:space="0"/>
               <w:right w:val="single" w:color="CCCCCC" w:sz="4" w:space="0"/>
             </w:tcBorders>
-            <w:shd w:val="clear"/>
+            <w:shd w:val="clear" w:color="auto" w:fill="auto"/>
             <w:tcMar>
               <w:top w:w="30" w:type="dxa"/>
               <w:left w:w="45" w:type="dxa"/>
@@ -1526,7 +1501,6 @@
                 <w:kern w:val="0"/>
                 <w:sz w:val="26"/>
                 <w:szCs w:val="26"/>
-                <w:bdr w:val="none" w:color="auto" w:sz="0" w:space="0"/>
                 <w:lang w:val="en-US" w:eastAsia="zh-CN" w:bidi="ar"/>
               </w:rPr>
               <w:t>Xây dựng hệ thống Logging (Qt Logging/QLoggingCategory), cấu hình Config (port, IP, log level), hỗ trợ Leader kiểm thử kết nối TCP. (Module UDP sẽ triển khai ở Sprint sau.)</w:t>
@@ -1544,7 +1518,7 @@
             <w:insideH w:val="outset" w:color="auto" w:sz="6" w:space="0"/>
             <w:insideV w:val="outset" w:color="auto" w:sz="6" w:space="0"/>
           </w:tblBorders>
-          <w:shd w:val="clear"/>
+          <w:shd w:val="clear" w:color="auto" w:fill="auto"/>
           <w:tblCellMar>
             <w:top w:w="0" w:type="dxa"/>
             <w:left w:w="0" w:type="dxa"/>
@@ -1564,7 +1538,7 @@
               <w:bottom w:val="single" w:color="CCCCCC" w:sz="4" w:space="0"/>
               <w:right w:val="single" w:color="CCCCCC" w:sz="4" w:space="0"/>
             </w:tcBorders>
-            <w:shd w:val="clear"/>
+            <w:shd w:val="clear" w:color="auto" w:fill="auto"/>
             <w:tcMar>
               <w:top w:w="30" w:type="dxa"/>
               <w:left w:w="45" w:type="dxa"/>
@@ -1594,7 +1568,6 @@
                 <w:kern w:val="0"/>
                 <w:sz w:val="26"/>
                 <w:szCs w:val="26"/>
-                <w:bdr w:val="none" w:color="auto" w:sz="0" w:space="0"/>
                 <w:lang w:val="en-US" w:eastAsia="zh-CN" w:bidi="ar"/>
               </w:rPr>
               <w:t>Trần Ngô Duy Khang</w:t>
@@ -1610,7 +1583,7 @@
               <w:bottom w:val="single" w:color="CCCCCC" w:sz="4" w:space="0"/>
               <w:right w:val="single" w:color="CCCCCC" w:sz="4" w:space="0"/>
             </w:tcBorders>
-            <w:shd w:val="clear"/>
+            <w:shd w:val="clear" w:color="auto" w:fill="auto"/>
             <w:tcMar>
               <w:top w:w="30" w:type="dxa"/>
               <w:left w:w="45" w:type="dxa"/>
@@ -1640,7 +1613,6 @@
                 <w:kern w:val="0"/>
                 <w:sz w:val="26"/>
                 <w:szCs w:val="26"/>
-                <w:bdr w:val="none" w:color="auto" w:sz="0" w:space="0"/>
                 <w:lang w:val="en-US" w:eastAsia="zh-CN" w:bidi="ar"/>
               </w:rPr>
               <w:t>Thiết kế giao diện Qt Widgets: Main Window, Sidebar, danh sách Peer (giao diện mẫu), cửa sổ Chat, ô nhập tin nhắn, nút Connect, Send.</w:t>
@@ -1658,7 +1630,6 @@
             <w:insideH w:val="outset" w:color="auto" w:sz="6" w:space="0"/>
             <w:insideV w:val="outset" w:color="auto" w:sz="6" w:space="0"/>
           </w:tblBorders>
-          <w:shd w:val="clear"/>
           <w:tblCellMar>
             <w:top w:w="0" w:type="dxa"/>
             <w:left w:w="0" w:type="dxa"/>
@@ -1678,7 +1649,7 @@
               <w:bottom w:val="single" w:color="CCCCCC" w:sz="4" w:space="0"/>
               <w:right w:val="single" w:color="CCCCCC" w:sz="4" w:space="0"/>
             </w:tcBorders>
-            <w:shd w:val="clear"/>
+            <w:shd w:val="clear" w:color="auto" w:fill="auto"/>
             <w:tcMar>
               <w:top w:w="30" w:type="dxa"/>
               <w:left w:w="45" w:type="dxa"/>
@@ -1708,7 +1679,6 @@
                 <w:kern w:val="0"/>
                 <w:sz w:val="26"/>
                 <w:szCs w:val="26"/>
-                <w:bdr w:val="none" w:color="auto" w:sz="0" w:space="0"/>
                 <w:lang w:val="en-US" w:eastAsia="zh-CN" w:bidi="ar"/>
               </w:rPr>
               <w:t>Ngủ Hoàng Khang</w:t>
@@ -1724,7 +1694,7 @@
               <w:bottom w:val="single" w:color="CCCCCC" w:sz="4" w:space="0"/>
               <w:right w:val="single" w:color="CCCCCC" w:sz="4" w:space="0"/>
             </w:tcBorders>
-            <w:shd w:val="clear"/>
+            <w:shd w:val="clear" w:color="auto" w:fill="auto"/>
             <w:tcMar>
               <w:top w:w="30" w:type="dxa"/>
               <w:left w:w="45" w:type="dxa"/>
@@ -1754,7 +1724,6 @@
                 <w:kern w:val="0"/>
                 <w:sz w:val="26"/>
                 <w:szCs w:val="26"/>
-                <w:bdr w:val="none" w:color="auto" w:sz="0" w:space="0"/>
                 <w:lang w:val="en-US" w:eastAsia="zh-CN" w:bidi="ar"/>
               </w:rPr>
               <w:t>Thiết kế giao thức truyền dữ liệu (Length Prefix + JSON), xây dựng chức năng gửi/nhận tin nhắn Text 1-1 qua TCP, kiểm tra giới hạn kích thước gói tin.</w:t>
@@ -1772,7 +1741,6 @@
             <w:insideH w:val="outset" w:color="auto" w:sz="6" w:space="0"/>
             <w:insideV w:val="outset" w:color="auto" w:sz="6" w:space="0"/>
           </w:tblBorders>
-          <w:shd w:val="clear"/>
           <w:tblCellMar>
             <w:top w:w="0" w:type="dxa"/>
             <w:left w:w="0" w:type="dxa"/>
@@ -1792,7 +1760,7 @@
               <w:bottom w:val="single" w:color="CCCCCC" w:sz="4" w:space="0"/>
               <w:right w:val="single" w:color="CCCCCC" w:sz="4" w:space="0"/>
             </w:tcBorders>
-            <w:shd w:val="clear"/>
+            <w:shd w:val="clear" w:color="auto" w:fill="auto"/>
             <w:tcMar>
               <w:top w:w="30" w:type="dxa"/>
               <w:left w:w="45" w:type="dxa"/>
@@ -1822,7 +1790,6 @@
                 <w:kern w:val="0"/>
                 <w:sz w:val="26"/>
                 <w:szCs w:val="26"/>
-                <w:bdr w:val="none" w:color="auto" w:sz="0" w:space="0"/>
                 <w:lang w:val="en-US" w:eastAsia="zh-CN" w:bidi="ar"/>
               </w:rPr>
               <w:t>Nguyễn Thanh Khánh</w:t>
@@ -1838,7 +1805,7 @@
               <w:bottom w:val="single" w:color="CCCCCC" w:sz="4" w:space="0"/>
               <w:right w:val="single" w:color="CCCCCC" w:sz="4" w:space="0"/>
             </w:tcBorders>
-            <w:shd w:val="clear"/>
+            <w:shd w:val="clear" w:color="auto" w:fill="auto"/>
             <w:tcMar>
               <w:top w:w="30" w:type="dxa"/>
               <w:left w:w="45" w:type="dxa"/>
@@ -1868,7 +1835,6 @@
                 <w:kern w:val="0"/>
                 <w:sz w:val="26"/>
                 <w:szCs w:val="26"/>
-                <w:bdr w:val="none" w:color="auto" w:sz="0" w:space="0"/>
                 <w:lang w:val="en-US" w:eastAsia="zh-CN" w:bidi="ar"/>
               </w:rPr>
               <w:t>Tích hợp mã hóa End-to-End (RSA trao đổi khóa + Fernet Session Key), mã hóa/giải mã dữ liệu sau Handshake. (File Transfer triển khai ở Sprint sau.)</w:t>
@@ -1886,7 +1852,7 @@
             <w:insideH w:val="outset" w:color="auto" w:sz="6" w:space="0"/>
             <w:insideV w:val="outset" w:color="auto" w:sz="6" w:space="0"/>
           </w:tblBorders>
-          <w:shd w:val="clear"/>
+          <w:shd w:val="clear" w:color="auto" w:fill="auto"/>
           <w:tblCellMar>
             <w:top w:w="0" w:type="dxa"/>
             <w:left w:w="0" w:type="dxa"/>
@@ -1906,7 +1872,7 @@
               <w:bottom w:val="single" w:color="CCCCCC" w:sz="4" w:space="0"/>
               <w:right w:val="single" w:color="CCCCCC" w:sz="4" w:space="0"/>
             </w:tcBorders>
-            <w:shd w:val="clear"/>
+            <w:shd w:val="clear" w:color="auto" w:fill="auto"/>
             <w:tcMar>
               <w:top w:w="30" w:type="dxa"/>
               <w:left w:w="45" w:type="dxa"/>
@@ -1936,7 +1902,6 @@
                 <w:kern w:val="0"/>
                 <w:sz w:val="26"/>
                 <w:szCs w:val="26"/>
-                <w:bdr w:val="none" w:color="auto" w:sz="0" w:space="0"/>
                 <w:lang w:val="en-US" w:eastAsia="zh-CN" w:bidi="ar"/>
               </w:rPr>
               <w:t>Lương Quốc Khánh</w:t>
@@ -1952,7 +1917,7 @@
               <w:bottom w:val="single" w:color="CCCCCC" w:sz="4" w:space="0"/>
               <w:right w:val="single" w:color="CCCCCC" w:sz="4" w:space="0"/>
             </w:tcBorders>
-            <w:shd w:val="clear"/>
+            <w:shd w:val="clear" w:color="auto" w:fill="auto"/>
             <w:tcMar>
               <w:top w:w="30" w:type="dxa"/>
               <w:left w:w="45" w:type="dxa"/>
@@ -1982,7 +1947,6 @@
                 <w:kern w:val="0"/>
                 <w:sz w:val="26"/>
                 <w:szCs w:val="26"/>
-                <w:bdr w:val="none" w:color="auto" w:sz="0" w:space="0"/>
                 <w:lang w:val="en-US" w:eastAsia="zh-CN" w:bidi="ar"/>
               </w:rPr>
               <w:t>Xử lý ngoại lệ (Timeout, Invalid Packet, Disconnect), Graceful Shutdown, xây dựng Unit Test cho Framing, Handshake, TCP Transport và hỗ trợ kiểm thử tích hợp.</w:t>
@@ -1999,6 +1963,2243 @@
           <w:szCs w:val="26"/>
         </w:rPr>
       </w:pPr>
+    </w:p>
+    <w:tbl>
+      <w:tblPr>
+        <w:tblStyle w:val="3"/>
+        <w:tblW w:w="10464" w:type="dxa"/>
+        <w:tblInd w:w="-1409" w:type="dxa"/>
+        <w:tblBorders>
+          <w:top w:val="single" w:color="auto" w:sz="2" w:space="0"/>
+          <w:left w:val="single" w:color="auto" w:sz="2" w:space="0"/>
+          <w:bottom w:val="single" w:color="auto" w:sz="2" w:space="0"/>
+          <w:right w:val="single" w:color="auto" w:sz="2" w:space="0"/>
+          <w:insideH w:val="none" w:color="auto" w:sz="0" w:space="0"/>
+          <w:insideV w:val="none" w:color="auto" w:sz="0" w:space="0"/>
+        </w:tblBorders>
+        <w:shd w:val="clear" w:color="auto" w:fill="FFFFFF"/>
+        <w:tblLayout w:type="autofit"/>
+        <w:tblCellMar>
+          <w:top w:w="0" w:type="dxa"/>
+          <w:left w:w="0" w:type="dxa"/>
+          <w:bottom w:w="0" w:type="dxa"/>
+          <w:right w:w="0" w:type="dxa"/>
+        </w:tblCellMar>
+      </w:tblPr>
+      <w:tblGrid>
+        <w:gridCol w:w="4147"/>
+        <w:gridCol w:w="6317"/>
+      </w:tblGrid>
+      <w:tr>
+        <w:tblPrEx>
+          <w:tblBorders>
+            <w:top w:val="single" w:color="auto" w:sz="2" w:space="0"/>
+            <w:left w:val="single" w:color="auto" w:sz="2" w:space="0"/>
+            <w:bottom w:val="single" w:color="auto" w:sz="2" w:space="0"/>
+            <w:right w:val="single" w:color="auto" w:sz="2" w:space="0"/>
+            <w:insideH w:val="none" w:color="auto" w:sz="0" w:space="0"/>
+            <w:insideV w:val="none" w:color="auto" w:sz="0" w:space="0"/>
+          </w:tblBorders>
+          <w:shd w:val="clear" w:color="auto" w:fill="FFFFFF"/>
+          <w:tblCellMar>
+            <w:top w:w="0" w:type="dxa"/>
+            <w:left w:w="0" w:type="dxa"/>
+            <w:bottom w:w="0" w:type="dxa"/>
+            <w:right w:w="0" w:type="dxa"/>
+          </w:tblCellMar>
+        </w:tblPrEx>
+        <w:tc>
+          <w:tcPr>
+            <w:tcW w:w="4147" w:type="dxa"/>
+            <w:tcBorders>
+              <w:top w:val="single" w:color="808080" w:sz="8" w:space="0"/>
+              <w:left w:val="single" w:color="808080" w:sz="8" w:space="0"/>
+              <w:bottom w:val="single" w:color="808080" w:sz="8" w:space="0"/>
+              <w:right w:val="single" w:color="808080" w:sz="8" w:space="0"/>
+            </w:tcBorders>
+            <w:shd w:val="clear" w:color="auto" w:fill="FFFFFF"/>
+            <w:tcMar>
+              <w:left w:w="0" w:type="dxa"/>
+              <w:right w:w="0" w:type="dxa"/>
+            </w:tcMar>
+            <w:vAlign w:val="center"/>
+          </w:tcPr>
+          <w:p>
+            <w:pPr>
+              <w:pStyle w:val="4"/>
+              <w:keepNext w:val="0"/>
+              <w:keepLines w:val="0"/>
+              <w:widowControl/>
+              <w:suppressLineNumbers w:val="0"/>
+              <w:pBdr>
+                <w:top w:val="none" w:color="auto" w:sz="0" w:space="0"/>
+                <w:left w:val="none" w:color="auto" w:sz="0" w:space="0"/>
+                <w:bottom w:val="none" w:color="auto" w:sz="0" w:space="0"/>
+                <w:right w:val="none" w:color="auto" w:sz="0" w:space="0"/>
+              </w:pBdr>
+              <w:spacing w:before="0" w:beforeAutospacing="0" w:after="200" w:afterAutospacing="0" w:line="14" w:lineRule="atLeast"/>
+              <w:ind w:left="0" w:right="0"/>
+              <w:jc w:val="center"/>
+              <w:rPr>
+                <w:rFonts w:ascii="Arial" w:hAnsi="Arial" w:cs="Arial"/>
+                <w:sz w:val="21"/>
+                <w:szCs w:val="21"/>
+              </w:rPr>
+            </w:pPr>
+            <w:r>
+              <w:rPr>
+                <w:rFonts w:hint="default" w:ascii="Arial" w:hAnsi="Arial" w:eastAsia="Segoe UI" w:cs="Arial"/>
+                <w:b w:val="0"/>
+                <w:bCs w:val="0"/>
+                <w:i w:val="0"/>
+                <w:iCs w:val="0"/>
+                <w:caps w:val="0"/>
+                <w:color w:val="000000"/>
+                <w:spacing w:val="0"/>
+                <w:sz w:val="32"/>
+                <w:szCs w:val="32"/>
+              </w:rPr>
+              <w:t>TÊN</w:t>
+            </w:r>
+          </w:p>
+        </w:tc>
+        <w:tc>
+          <w:tcPr>
+            <w:tcW w:w="6317" w:type="dxa"/>
+            <w:tcBorders>
+              <w:top w:val="single" w:color="808080" w:sz="8" w:space="0"/>
+              <w:left w:val="single" w:color="808080" w:sz="8" w:space="0"/>
+              <w:bottom w:val="single" w:color="808080" w:sz="8" w:space="0"/>
+              <w:right w:val="single" w:color="808080" w:sz="8" w:space="0"/>
+            </w:tcBorders>
+            <w:shd w:val="clear" w:color="auto" w:fill="FFFFFF"/>
+            <w:tcMar>
+              <w:left w:w="0" w:type="dxa"/>
+              <w:right w:w="0" w:type="dxa"/>
+            </w:tcMar>
+            <w:vAlign w:val="center"/>
+          </w:tcPr>
+          <w:p>
+            <w:pPr>
+              <w:pStyle w:val="4"/>
+              <w:keepNext w:val="0"/>
+              <w:keepLines w:val="0"/>
+              <w:widowControl/>
+              <w:suppressLineNumbers w:val="0"/>
+              <w:pBdr>
+                <w:top w:val="none" w:color="auto" w:sz="0" w:space="0"/>
+                <w:left w:val="none" w:color="auto" w:sz="0" w:space="0"/>
+                <w:bottom w:val="none" w:color="auto" w:sz="0" w:space="0"/>
+                <w:right w:val="none" w:color="auto" w:sz="0" w:space="0"/>
+              </w:pBdr>
+              <w:spacing w:before="0" w:beforeAutospacing="0" w:after="200" w:afterAutospacing="0" w:line="14" w:lineRule="atLeast"/>
+              <w:ind w:left="0" w:right="0"/>
+              <w:jc w:val="center"/>
+              <w:rPr>
+                <w:rFonts w:hint="default" w:ascii="Arial" w:hAnsi="Arial" w:cs="Arial"/>
+                <w:sz w:val="21"/>
+                <w:szCs w:val="21"/>
+              </w:rPr>
+            </w:pPr>
+            <w:r>
+              <w:rPr>
+                <w:rFonts w:hint="default" w:ascii="Arial" w:hAnsi="Arial" w:eastAsia="Segoe UI" w:cs="Arial"/>
+                <w:b w:val="0"/>
+                <w:bCs w:val="0"/>
+                <w:i w:val="0"/>
+                <w:iCs w:val="0"/>
+                <w:caps w:val="0"/>
+                <w:color w:val="000000"/>
+                <w:spacing w:val="0"/>
+                <w:sz w:val="32"/>
+                <w:szCs w:val="32"/>
+              </w:rPr>
+              <w:t>TUẦN 1</w:t>
+            </w:r>
+          </w:p>
+        </w:tc>
+      </w:tr>
+      <w:tr>
+        <w:tblPrEx>
+          <w:tblBorders>
+            <w:top w:val="single" w:color="auto" w:sz="2" w:space="0"/>
+            <w:left w:val="single" w:color="auto" w:sz="2" w:space="0"/>
+            <w:bottom w:val="single" w:color="auto" w:sz="2" w:space="0"/>
+            <w:right w:val="single" w:color="auto" w:sz="2" w:space="0"/>
+            <w:insideH w:val="none" w:color="auto" w:sz="0" w:space="0"/>
+            <w:insideV w:val="none" w:color="auto" w:sz="0" w:space="0"/>
+          </w:tblBorders>
+          <w:shd w:val="clear" w:color="auto" w:fill="FFFFFF"/>
+          <w:tblCellMar>
+            <w:top w:w="0" w:type="dxa"/>
+            <w:left w:w="0" w:type="dxa"/>
+            <w:bottom w:w="0" w:type="dxa"/>
+            <w:right w:w="0" w:type="dxa"/>
+          </w:tblCellMar>
+        </w:tblPrEx>
+        <w:tc>
+          <w:tcPr>
+            <w:tcW w:w="4147" w:type="dxa"/>
+            <w:tcBorders>
+              <w:top w:val="single" w:color="808080" w:sz="8" w:space="0"/>
+              <w:left w:val="single" w:color="808080" w:sz="8" w:space="0"/>
+              <w:bottom w:val="single" w:color="808080" w:sz="8" w:space="0"/>
+              <w:right w:val="single" w:color="808080" w:sz="8" w:space="0"/>
+            </w:tcBorders>
+            <w:shd w:val="clear" w:color="auto" w:fill="FFFFFF"/>
+            <w:tcMar>
+              <w:left w:w="0" w:type="dxa"/>
+              <w:right w:w="0" w:type="dxa"/>
+            </w:tcMar>
+            <w:vAlign w:val="center"/>
+          </w:tcPr>
+          <w:p>
+            <w:pPr>
+              <w:pStyle w:val="4"/>
+              <w:keepNext w:val="0"/>
+              <w:keepLines w:val="0"/>
+              <w:widowControl/>
+              <w:suppressLineNumbers w:val="0"/>
+              <w:pBdr>
+                <w:top w:val="none" w:color="auto" w:sz="0" w:space="0"/>
+                <w:left w:val="none" w:color="auto" w:sz="0" w:space="0"/>
+                <w:bottom w:val="none" w:color="auto" w:sz="0" w:space="0"/>
+                <w:right w:val="none" w:color="auto" w:sz="0" w:space="0"/>
+              </w:pBdr>
+              <w:spacing w:before="0" w:beforeAutospacing="0" w:after="200" w:afterAutospacing="0" w:line="14" w:lineRule="atLeast"/>
+              <w:ind w:left="0" w:right="0"/>
+              <w:jc w:val="left"/>
+              <w:rPr>
+                <w:rFonts w:hint="default" w:ascii="Arial" w:hAnsi="Arial" w:cs="Arial"/>
+                <w:sz w:val="21"/>
+                <w:szCs w:val="21"/>
+              </w:rPr>
+            </w:pPr>
+            <w:r>
+              <w:rPr>
+                <w:rFonts w:hint="default" w:ascii="Arial" w:hAnsi="Arial" w:eastAsia="Segoe UI" w:cs="Arial"/>
+                <w:b/>
+                <w:bCs/>
+                <w:i w:val="0"/>
+                <w:iCs w:val="0"/>
+                <w:caps w:val="0"/>
+                <w:color w:val="000000"/>
+                <w:spacing w:val="0"/>
+                <w:sz w:val="23"/>
+                <w:szCs w:val="23"/>
+              </w:rPr>
+              <w:t>Huỳnh Văn Tại</w:t>
+            </w:r>
+          </w:p>
+          <w:p>
+            <w:pPr>
+              <w:pStyle w:val="4"/>
+              <w:keepNext w:val="0"/>
+              <w:keepLines w:val="0"/>
+              <w:widowControl/>
+              <w:suppressLineNumbers w:val="0"/>
+              <w:pBdr>
+                <w:top w:val="none" w:color="auto" w:sz="0" w:space="0"/>
+                <w:left w:val="none" w:color="auto" w:sz="0" w:space="0"/>
+                <w:bottom w:val="none" w:color="auto" w:sz="0" w:space="0"/>
+                <w:right w:val="none" w:color="auto" w:sz="0" w:space="0"/>
+              </w:pBdr>
+              <w:spacing w:before="40" w:beforeAutospacing="0" w:after="0" w:afterAutospacing="0" w:line="14" w:lineRule="atLeast"/>
+              <w:ind w:left="0" w:right="0"/>
+              <w:rPr>
+                <w:rFonts w:hint="default" w:ascii="Arial" w:hAnsi="Arial" w:cs="Arial"/>
+                <w:sz w:val="21"/>
+                <w:szCs w:val="21"/>
+              </w:rPr>
+            </w:pPr>
+            <w:r>
+              <w:rPr>
+                <w:rFonts w:hint="default" w:ascii="Arial" w:hAnsi="Arial" w:eastAsia="Segoe UI" w:cs="Arial"/>
+                <w:i/>
+                <w:iCs/>
+                <w:caps w:val="0"/>
+                <w:color w:val="000000"/>
+                <w:spacing w:val="0"/>
+                <w:sz w:val="19"/>
+                <w:szCs w:val="19"/>
+              </w:rPr>
+              <w:t>(Trưởng nhóm - Kiến trúc)</w:t>
+            </w:r>
+          </w:p>
+        </w:tc>
+        <w:tc>
+          <w:tcPr>
+            <w:tcW w:w="6317" w:type="dxa"/>
+            <w:tcBorders>
+              <w:top w:val="single" w:color="808080" w:sz="8" w:space="0"/>
+              <w:left w:val="single" w:color="808080" w:sz="8" w:space="0"/>
+              <w:bottom w:val="single" w:color="808080" w:sz="8" w:space="0"/>
+              <w:right w:val="single" w:color="808080" w:sz="8" w:space="0"/>
+            </w:tcBorders>
+            <w:shd w:val="clear" w:color="auto" w:fill="FFFFFF"/>
+            <w:tcMar>
+              <w:left w:w="0" w:type="dxa"/>
+              <w:right w:w="0" w:type="dxa"/>
+            </w:tcMar>
+            <w:vAlign w:val="center"/>
+          </w:tcPr>
+          <w:p>
+            <w:pPr>
+              <w:pStyle w:val="4"/>
+              <w:keepNext w:val="0"/>
+              <w:keepLines w:val="0"/>
+              <w:widowControl/>
+              <w:suppressLineNumbers w:val="0"/>
+              <w:pBdr>
+                <w:top w:val="none" w:color="auto" w:sz="0" w:space="0"/>
+                <w:left w:val="none" w:color="auto" w:sz="0" w:space="0"/>
+                <w:bottom w:val="none" w:color="auto" w:sz="0" w:space="0"/>
+                <w:right w:val="none" w:color="auto" w:sz="0" w:space="0"/>
+              </w:pBdr>
+              <w:spacing w:before="0" w:beforeAutospacing="0" w:after="20" w:afterAutospacing="0" w:line="12" w:lineRule="atLeast"/>
+              <w:ind w:left="0" w:right="0"/>
+              <w:rPr>
+                <w:rFonts w:hint="default" w:ascii="Arial" w:hAnsi="Arial" w:cs="Arial"/>
+                <w:sz w:val="21"/>
+                <w:szCs w:val="21"/>
+              </w:rPr>
+            </w:pPr>
+            <w:r>
+              <w:rPr>
+                <w:rFonts w:hint="default" w:ascii="Arial" w:hAnsi="Arial" w:eastAsia="Segoe UI" w:cs="Arial"/>
+                <w:i w:val="0"/>
+                <w:iCs w:val="0"/>
+                <w:caps w:val="0"/>
+                <w:color w:val="000000"/>
+                <w:spacing w:val="0"/>
+                <w:sz w:val="20"/>
+                <w:szCs w:val="20"/>
+              </w:rPr>
+              <w:t>• Tạo config.py quản lý cổng, máy chủ, thời gian chờ, mức ghi nhật ký.</w:t>
+            </w:r>
+          </w:p>
+          <w:p>
+            <w:pPr>
+              <w:pStyle w:val="4"/>
+              <w:keepNext w:val="0"/>
+              <w:keepLines w:val="0"/>
+              <w:widowControl/>
+              <w:suppressLineNumbers w:val="0"/>
+              <w:pBdr>
+                <w:top w:val="none" w:color="auto" w:sz="0" w:space="0"/>
+                <w:left w:val="none" w:color="auto" w:sz="0" w:space="0"/>
+                <w:bottom w:val="none" w:color="auto" w:sz="0" w:space="0"/>
+                <w:right w:val="none" w:color="auto" w:sz="0" w:space="0"/>
+              </w:pBdr>
+              <w:spacing w:before="0" w:beforeAutospacing="0" w:after="20" w:afterAutospacing="0" w:line="12" w:lineRule="atLeast"/>
+              <w:ind w:left="0" w:right="0"/>
+              <w:rPr>
+                <w:rFonts w:hint="default" w:ascii="Arial" w:hAnsi="Arial" w:cs="Arial"/>
+                <w:sz w:val="21"/>
+                <w:szCs w:val="21"/>
+              </w:rPr>
+            </w:pPr>
+            <w:r>
+              <w:rPr>
+                <w:rFonts w:hint="default" w:ascii="Arial" w:hAnsi="Arial" w:eastAsia="Segoe UI" w:cs="Arial"/>
+                <w:i w:val="0"/>
+                <w:iCs w:val="0"/>
+                <w:caps w:val="0"/>
+                <w:color w:val="000000"/>
+                <w:spacing w:val="0"/>
+                <w:sz w:val="20"/>
+                <w:szCs w:val="20"/>
+              </w:rPr>
+              <w:t>• Thiết kế và xem xét kiến trúc GUI (Tkinter hoặc PyQt5).</w:t>
+            </w:r>
+          </w:p>
+          <w:p>
+            <w:pPr>
+              <w:pStyle w:val="4"/>
+              <w:keepNext w:val="0"/>
+              <w:keepLines w:val="0"/>
+              <w:widowControl/>
+              <w:suppressLineNumbers w:val="0"/>
+              <w:pBdr>
+                <w:top w:val="none" w:color="auto" w:sz="0" w:space="0"/>
+                <w:left w:val="none" w:color="auto" w:sz="0" w:space="0"/>
+                <w:bottom w:val="none" w:color="auto" w:sz="0" w:space="0"/>
+                <w:right w:val="none" w:color="auto" w:sz="0" w:space="0"/>
+              </w:pBdr>
+              <w:spacing w:before="0" w:beforeAutospacing="0" w:after="20" w:afterAutospacing="0" w:line="12" w:lineRule="atLeast"/>
+              <w:ind w:left="0" w:right="0"/>
+              <w:rPr>
+                <w:rFonts w:hint="default" w:ascii="Arial" w:hAnsi="Arial" w:cs="Arial"/>
+                <w:sz w:val="21"/>
+                <w:szCs w:val="21"/>
+              </w:rPr>
+            </w:pPr>
+            <w:r>
+              <w:rPr>
+                <w:rFonts w:hint="default" w:ascii="Arial" w:hAnsi="Arial" w:eastAsia="Segoe UI" w:cs="Arial"/>
+                <w:i w:val="0"/>
+                <w:iCs w:val="0"/>
+                <w:caps w:val="0"/>
+                <w:color w:val="000000"/>
+                <w:spacing w:val="0"/>
+                <w:sz w:val="20"/>
+                <w:szCs w:val="20"/>
+              </w:rPr>
+              <w:t>• Tài liệu hóa chi tiết (chuỗi bắt tay, dạng tin nhắn).</w:t>
+            </w:r>
+          </w:p>
+          <w:p>
+            <w:pPr>
+              <w:pStyle w:val="4"/>
+              <w:keepNext w:val="0"/>
+              <w:keepLines w:val="0"/>
+              <w:widowControl/>
+              <w:suppressLineNumbers w:val="0"/>
+              <w:pBdr>
+                <w:top w:val="none" w:color="auto" w:sz="0" w:space="0"/>
+                <w:left w:val="none" w:color="auto" w:sz="0" w:space="0"/>
+                <w:bottom w:val="none" w:color="auto" w:sz="0" w:space="0"/>
+                <w:right w:val="none" w:color="auto" w:sz="0" w:space="0"/>
+              </w:pBdr>
+              <w:spacing w:before="0" w:beforeAutospacing="0" w:after="20" w:afterAutospacing="0" w:line="12" w:lineRule="atLeast"/>
+              <w:ind w:left="0" w:right="0"/>
+              <w:rPr>
+                <w:rFonts w:hint="default" w:ascii="Arial" w:hAnsi="Arial" w:cs="Arial"/>
+                <w:sz w:val="21"/>
+                <w:szCs w:val="21"/>
+              </w:rPr>
+            </w:pPr>
+            <w:r>
+              <w:rPr>
+                <w:rFonts w:hint="default" w:ascii="Arial" w:hAnsi="Arial" w:eastAsia="Segoe UI" w:cs="Arial"/>
+                <w:i w:val="0"/>
+                <w:iCs w:val="0"/>
+                <w:caps w:val="0"/>
+                <w:color w:val="000000"/>
+                <w:spacing w:val="0"/>
+                <w:sz w:val="20"/>
+                <w:szCs w:val="20"/>
+              </w:rPr>
+              <w:t>• Thiết lập quy trình CI/CD (kiểm thử bằng GitHub Actions).</w:t>
+            </w:r>
+          </w:p>
+          <w:p>
+            <w:pPr>
+              <w:pStyle w:val="4"/>
+              <w:keepNext w:val="0"/>
+              <w:keepLines w:val="0"/>
+              <w:widowControl/>
+              <w:suppressLineNumbers w:val="0"/>
+              <w:pBdr>
+                <w:top w:val="none" w:color="auto" w:sz="0" w:space="0"/>
+                <w:left w:val="none" w:color="auto" w:sz="0" w:space="0"/>
+                <w:bottom w:val="none" w:color="auto" w:sz="0" w:space="0"/>
+                <w:right w:val="none" w:color="auto" w:sz="0" w:space="0"/>
+              </w:pBdr>
+              <w:spacing w:before="0" w:beforeAutospacing="0" w:after="20" w:afterAutospacing="0" w:line="12" w:lineRule="atLeast"/>
+              <w:ind w:left="0" w:right="0"/>
+              <w:rPr>
+                <w:rFonts w:hint="default" w:ascii="Arial" w:hAnsi="Arial" w:cs="Arial"/>
+                <w:sz w:val="21"/>
+                <w:szCs w:val="21"/>
+              </w:rPr>
+            </w:pPr>
+            <w:r>
+              <w:rPr>
+                <w:rFonts w:hint="default" w:ascii="Arial" w:hAnsi="Arial" w:eastAsia="Segoe UI" w:cs="Arial"/>
+                <w:i w:val="0"/>
+                <w:iCs w:val="0"/>
+                <w:caps w:val="0"/>
+                <w:color w:val="000000"/>
+                <w:spacing w:val="0"/>
+                <w:sz w:val="20"/>
+                <w:szCs w:val="20"/>
+              </w:rPr>
+              <w:t>• Xem xét các yêu cầu kéo (PR) từ các thành viên nhóm.</w:t>
+            </w:r>
+          </w:p>
+          <w:p>
+            <w:pPr>
+              <w:pStyle w:val="4"/>
+              <w:keepNext w:val="0"/>
+              <w:keepLines w:val="0"/>
+              <w:widowControl/>
+              <w:suppressLineNumbers w:val="0"/>
+              <w:pBdr>
+                <w:top w:val="none" w:color="auto" w:sz="0" w:space="0"/>
+                <w:left w:val="none" w:color="auto" w:sz="0" w:space="0"/>
+                <w:bottom w:val="none" w:color="auto" w:sz="0" w:space="0"/>
+                <w:right w:val="none" w:color="auto" w:sz="0" w:space="0"/>
+              </w:pBdr>
+              <w:spacing w:before="40" w:beforeAutospacing="0" w:after="0" w:afterAutospacing="0" w:line="14" w:lineRule="atLeast"/>
+              <w:ind w:left="0" w:right="0"/>
+              <w:rPr>
+                <w:rFonts w:hint="default" w:ascii="Arial" w:hAnsi="Arial" w:cs="Arial"/>
+                <w:sz w:val="21"/>
+                <w:szCs w:val="21"/>
+              </w:rPr>
+            </w:pPr>
+            <w:r>
+              <w:rPr>
+                <w:rFonts w:hint="default" w:ascii="Arial" w:hAnsi="Arial" w:eastAsia="Segoe UI" w:cs="Arial"/>
+                <w:b/>
+                <w:bCs/>
+                <w:i w:val="0"/>
+                <w:iCs w:val="0"/>
+                <w:caps w:val="0"/>
+                <w:color w:val="000000"/>
+                <w:spacing w:val="0"/>
+                <w:sz w:val="20"/>
+                <w:szCs w:val="20"/>
+              </w:rPr>
+              <w:t>Sản phẩm đầu ra: config.py; tài liệu quy trình; quy trình CI/CD.</w:t>
+            </w:r>
+          </w:p>
+        </w:tc>
+      </w:tr>
+      <w:tr>
+        <w:tblPrEx>
+          <w:tblBorders>
+            <w:top w:val="single" w:color="auto" w:sz="2" w:space="0"/>
+            <w:left w:val="single" w:color="auto" w:sz="2" w:space="0"/>
+            <w:bottom w:val="single" w:color="auto" w:sz="2" w:space="0"/>
+            <w:right w:val="single" w:color="auto" w:sz="2" w:space="0"/>
+            <w:insideH w:val="none" w:color="auto" w:sz="0" w:space="0"/>
+            <w:insideV w:val="none" w:color="auto" w:sz="0" w:space="0"/>
+          </w:tblBorders>
+          <w:shd w:val="clear" w:color="auto" w:fill="FFFFFF"/>
+          <w:tblCellMar>
+            <w:top w:w="0" w:type="dxa"/>
+            <w:left w:w="0" w:type="dxa"/>
+            <w:bottom w:w="0" w:type="dxa"/>
+            <w:right w:w="0" w:type="dxa"/>
+          </w:tblCellMar>
+        </w:tblPrEx>
+        <w:tc>
+          <w:tcPr>
+            <w:tcW w:w="4147" w:type="dxa"/>
+            <w:tcBorders>
+              <w:top w:val="single" w:color="808080" w:sz="8" w:space="0"/>
+              <w:left w:val="single" w:color="808080" w:sz="8" w:space="0"/>
+              <w:bottom w:val="single" w:color="808080" w:sz="8" w:space="0"/>
+              <w:right w:val="single" w:color="808080" w:sz="8" w:space="0"/>
+            </w:tcBorders>
+            <w:shd w:val="clear" w:color="auto" w:fill="FFFFFF"/>
+            <w:tcMar>
+              <w:left w:w="0" w:type="dxa"/>
+              <w:right w:w="0" w:type="dxa"/>
+            </w:tcMar>
+            <w:vAlign w:val="center"/>
+          </w:tcPr>
+          <w:p>
+            <w:pPr>
+              <w:pStyle w:val="4"/>
+              <w:keepNext w:val="0"/>
+              <w:keepLines w:val="0"/>
+              <w:widowControl/>
+              <w:suppressLineNumbers w:val="0"/>
+              <w:pBdr>
+                <w:top w:val="none" w:color="auto" w:sz="0" w:space="0"/>
+                <w:left w:val="none" w:color="auto" w:sz="0" w:space="0"/>
+                <w:bottom w:val="none" w:color="auto" w:sz="0" w:space="0"/>
+                <w:right w:val="none" w:color="auto" w:sz="0" w:space="0"/>
+              </w:pBdr>
+              <w:spacing w:before="0" w:beforeAutospacing="0" w:after="200" w:afterAutospacing="0" w:line="14" w:lineRule="atLeast"/>
+              <w:ind w:left="0" w:right="0"/>
+              <w:jc w:val="left"/>
+              <w:rPr>
+                <w:rFonts w:hint="default" w:ascii="Arial" w:hAnsi="Arial" w:cs="Arial"/>
+                <w:sz w:val="21"/>
+                <w:szCs w:val="21"/>
+              </w:rPr>
+            </w:pPr>
+            <w:r>
+              <w:rPr>
+                <w:rFonts w:hint="default" w:ascii="Arial" w:hAnsi="Arial" w:eastAsia="Segoe UI" w:cs="Arial"/>
+                <w:b/>
+                <w:bCs/>
+                <w:i w:val="0"/>
+                <w:iCs w:val="0"/>
+                <w:caps w:val="0"/>
+                <w:color w:val="000000"/>
+                <w:spacing w:val="0"/>
+                <w:sz w:val="23"/>
+                <w:szCs w:val="23"/>
+              </w:rPr>
+              <w:t>Ngô Đặng Minh Khôi</w:t>
+            </w:r>
+          </w:p>
+          <w:p>
+            <w:pPr>
+              <w:pStyle w:val="4"/>
+              <w:keepNext w:val="0"/>
+              <w:keepLines w:val="0"/>
+              <w:widowControl/>
+              <w:suppressLineNumbers w:val="0"/>
+              <w:pBdr>
+                <w:top w:val="none" w:color="auto" w:sz="0" w:space="0"/>
+                <w:left w:val="none" w:color="auto" w:sz="0" w:space="0"/>
+                <w:bottom w:val="none" w:color="auto" w:sz="0" w:space="0"/>
+                <w:right w:val="none" w:color="auto" w:sz="0" w:space="0"/>
+              </w:pBdr>
+              <w:spacing w:before="40" w:beforeAutospacing="0" w:after="0" w:afterAutospacing="0" w:line="14" w:lineRule="atLeast"/>
+              <w:ind w:left="0" w:right="0"/>
+              <w:rPr>
+                <w:rFonts w:hint="default" w:ascii="Arial" w:hAnsi="Arial" w:cs="Arial"/>
+                <w:sz w:val="21"/>
+                <w:szCs w:val="21"/>
+              </w:rPr>
+            </w:pPr>
+            <w:r>
+              <w:rPr>
+                <w:rFonts w:hint="default" w:ascii="Arial" w:hAnsi="Arial" w:eastAsia="Segoe UI" w:cs="Arial"/>
+                <w:i/>
+                <w:iCs/>
+                <w:caps w:val="0"/>
+                <w:color w:val="000000"/>
+                <w:spacing w:val="0"/>
+                <w:sz w:val="19"/>
+                <w:szCs w:val="19"/>
+              </w:rPr>
+              <w:t>(Mạng/Logging)</w:t>
+            </w:r>
+          </w:p>
+        </w:tc>
+        <w:tc>
+          <w:tcPr>
+            <w:tcW w:w="6317" w:type="dxa"/>
+            <w:tcBorders>
+              <w:top w:val="single" w:color="808080" w:sz="8" w:space="0"/>
+              <w:left w:val="single" w:color="808080" w:sz="8" w:space="0"/>
+              <w:bottom w:val="single" w:color="808080" w:sz="8" w:space="0"/>
+              <w:right w:val="single" w:color="808080" w:sz="8" w:space="0"/>
+            </w:tcBorders>
+            <w:shd w:val="clear" w:color="auto" w:fill="FFFFFF"/>
+            <w:tcMar>
+              <w:left w:w="0" w:type="dxa"/>
+              <w:right w:w="0" w:type="dxa"/>
+            </w:tcMar>
+            <w:vAlign w:val="center"/>
+          </w:tcPr>
+          <w:p>
+            <w:pPr>
+              <w:pStyle w:val="4"/>
+              <w:keepNext w:val="0"/>
+              <w:keepLines w:val="0"/>
+              <w:widowControl/>
+              <w:suppressLineNumbers w:val="0"/>
+              <w:pBdr>
+                <w:top w:val="none" w:color="auto" w:sz="0" w:space="0"/>
+                <w:left w:val="none" w:color="auto" w:sz="0" w:space="0"/>
+                <w:bottom w:val="none" w:color="auto" w:sz="0" w:space="0"/>
+                <w:right w:val="none" w:color="auto" w:sz="0" w:space="0"/>
+              </w:pBdr>
+              <w:spacing w:before="0" w:beforeAutospacing="0" w:after="20" w:afterAutospacing="0" w:line="12" w:lineRule="atLeast"/>
+              <w:ind w:left="0" w:right="0"/>
+              <w:rPr>
+                <w:rFonts w:hint="default" w:ascii="Arial" w:hAnsi="Arial" w:cs="Arial"/>
+                <w:sz w:val="21"/>
+                <w:szCs w:val="21"/>
+              </w:rPr>
+            </w:pPr>
+            <w:r>
+              <w:rPr>
+                <w:rFonts w:hint="default" w:ascii="Arial" w:hAnsi="Arial" w:eastAsia="Segoe UI" w:cs="Arial"/>
+                <w:i w:val="0"/>
+                <w:iCs w:val="0"/>
+                <w:caps w:val="0"/>
+                <w:color w:val="000000"/>
+                <w:spacing w:val="0"/>
+                <w:sz w:val="20"/>
+                <w:szCs w:val="20"/>
+              </w:rPr>
+              <w:t>• Triển khai hệ thống ghi nhật ký nâng cao (tệp + bảng điều khiển, cấp độ ghi nhật ký).</w:t>
+            </w:r>
+          </w:p>
+          <w:p>
+            <w:pPr>
+              <w:pStyle w:val="4"/>
+              <w:keepNext w:val="0"/>
+              <w:keepLines w:val="0"/>
+              <w:widowControl/>
+              <w:suppressLineNumbers w:val="0"/>
+              <w:pBdr>
+                <w:top w:val="none" w:color="auto" w:sz="0" w:space="0"/>
+                <w:left w:val="none" w:color="auto" w:sz="0" w:space="0"/>
+                <w:bottom w:val="none" w:color="auto" w:sz="0" w:space="0"/>
+                <w:right w:val="none" w:color="auto" w:sz="0" w:space="0"/>
+              </w:pBdr>
+              <w:spacing w:before="0" w:beforeAutospacing="0" w:after="20" w:afterAutospacing="0" w:line="12" w:lineRule="atLeast"/>
+              <w:ind w:left="0" w:right="0"/>
+              <w:rPr>
+                <w:rFonts w:hint="default" w:ascii="Arial" w:hAnsi="Arial" w:cs="Arial"/>
+                <w:sz w:val="21"/>
+                <w:szCs w:val="21"/>
+              </w:rPr>
+            </w:pPr>
+            <w:r>
+              <w:rPr>
+                <w:rFonts w:hint="default" w:ascii="Arial" w:hAnsi="Arial" w:eastAsia="Segoe UI" w:cs="Arial"/>
+                <w:i w:val="0"/>
+                <w:iCs w:val="0"/>
+                <w:caps w:val="0"/>
+                <w:color w:val="000000"/>
+                <w:spacing w:val="0"/>
+                <w:sz w:val="20"/>
+                <w:szCs w:val="20"/>
+              </w:rPr>
+              <w:t>• Thiết lập QLogging (Danh mục ghi nhật ký Qt) nếu sử dụng PyQt5.</w:t>
+            </w:r>
+          </w:p>
+          <w:p>
+            <w:pPr>
+              <w:pStyle w:val="4"/>
+              <w:keepNext w:val="0"/>
+              <w:keepLines w:val="0"/>
+              <w:widowControl/>
+              <w:suppressLineNumbers w:val="0"/>
+              <w:pBdr>
+                <w:top w:val="none" w:color="auto" w:sz="0" w:space="0"/>
+                <w:left w:val="none" w:color="auto" w:sz="0" w:space="0"/>
+                <w:bottom w:val="none" w:color="auto" w:sz="0" w:space="0"/>
+                <w:right w:val="none" w:color="auto" w:sz="0" w:space="0"/>
+              </w:pBdr>
+              <w:spacing w:before="0" w:beforeAutospacing="0" w:after="20" w:afterAutospacing="0" w:line="12" w:lineRule="atLeast"/>
+              <w:ind w:left="0" w:right="0"/>
+              <w:rPr>
+                <w:rFonts w:hint="default" w:ascii="Arial" w:hAnsi="Arial" w:cs="Arial"/>
+                <w:sz w:val="21"/>
+                <w:szCs w:val="21"/>
+              </w:rPr>
+            </w:pPr>
+            <w:r>
+              <w:rPr>
+                <w:rFonts w:hint="default" w:ascii="Arial" w:hAnsi="Arial" w:eastAsia="Segoe UI" w:cs="Arial"/>
+                <w:i w:val="0"/>
+                <w:iCs w:val="0"/>
+                <w:caps w:val="0"/>
+                <w:color w:val="000000"/>
+                <w:spacing w:val="0"/>
+                <w:sz w:val="20"/>
+                <w:szCs w:val="20"/>
+              </w:rPr>
+              <w:t>• Kiểm soát khả năng phục hồi mạng (logic kết nối lại).</w:t>
+            </w:r>
+          </w:p>
+          <w:p>
+            <w:pPr>
+              <w:pStyle w:val="4"/>
+              <w:keepNext w:val="0"/>
+              <w:keepLines w:val="0"/>
+              <w:widowControl/>
+              <w:suppressLineNumbers w:val="0"/>
+              <w:pBdr>
+                <w:top w:val="none" w:color="auto" w:sz="0" w:space="0"/>
+                <w:left w:val="none" w:color="auto" w:sz="0" w:space="0"/>
+                <w:bottom w:val="none" w:color="auto" w:sz="0" w:space="0"/>
+                <w:right w:val="none" w:color="auto" w:sz="0" w:space="0"/>
+              </w:pBdr>
+              <w:spacing w:before="0" w:beforeAutospacing="0" w:after="20" w:afterAutospacing="0" w:line="12" w:lineRule="atLeast"/>
+              <w:ind w:left="0" w:right="0"/>
+              <w:rPr>
+                <w:rFonts w:hint="default" w:ascii="Arial" w:hAnsi="Arial" w:cs="Arial"/>
+                <w:sz w:val="21"/>
+                <w:szCs w:val="21"/>
+              </w:rPr>
+            </w:pPr>
+            <w:r>
+              <w:rPr>
+                <w:rFonts w:hint="default" w:ascii="Arial" w:hAnsi="Arial" w:eastAsia="Segoe UI" w:cs="Arial"/>
+                <w:i w:val="0"/>
+                <w:iCs w:val="0"/>
+                <w:caps w:val="0"/>
+                <w:color w:val="000000"/>
+                <w:spacing w:val="0"/>
+                <w:sz w:val="20"/>
+                <w:szCs w:val="20"/>
+              </w:rPr>
+              <w:t>• Leader kiểm thử kết nối TCP với nhiều Config (port, IP).</w:t>
+            </w:r>
+          </w:p>
+          <w:p>
+            <w:pPr>
+              <w:pStyle w:val="4"/>
+              <w:keepNext w:val="0"/>
+              <w:keepLines w:val="0"/>
+              <w:widowControl/>
+              <w:suppressLineNumbers w:val="0"/>
+              <w:pBdr>
+                <w:top w:val="none" w:color="auto" w:sz="0" w:space="0"/>
+                <w:left w:val="none" w:color="auto" w:sz="0" w:space="0"/>
+                <w:bottom w:val="none" w:color="auto" w:sz="0" w:space="0"/>
+                <w:right w:val="none" w:color="auto" w:sz="0" w:space="0"/>
+              </w:pBdr>
+              <w:spacing w:before="0" w:beforeAutospacing="0" w:after="20" w:afterAutospacing="0" w:line="12" w:lineRule="atLeast"/>
+              <w:ind w:left="0" w:right="0"/>
+              <w:rPr>
+                <w:rFonts w:hint="default" w:ascii="Arial" w:hAnsi="Arial" w:cs="Arial"/>
+                <w:sz w:val="21"/>
+                <w:szCs w:val="21"/>
+              </w:rPr>
+            </w:pPr>
+            <w:r>
+              <w:rPr>
+                <w:rFonts w:hint="default" w:ascii="Arial" w:hAnsi="Arial" w:eastAsia="Segoe UI" w:cs="Arial"/>
+                <w:i w:val="0"/>
+                <w:iCs w:val="0"/>
+                <w:caps w:val="0"/>
+                <w:color w:val="000000"/>
+                <w:spacing w:val="0"/>
+                <w:sz w:val="20"/>
+                <w:szCs w:val="20"/>
+              </w:rPr>
+              <w:t>• Công cụ gỡ lỗi UDP dạng mô-đun (tùy chọn).</w:t>
+            </w:r>
+          </w:p>
+          <w:p>
+            <w:pPr>
+              <w:pStyle w:val="4"/>
+              <w:keepNext w:val="0"/>
+              <w:keepLines w:val="0"/>
+              <w:widowControl/>
+              <w:suppressLineNumbers w:val="0"/>
+              <w:pBdr>
+                <w:top w:val="none" w:color="auto" w:sz="0" w:space="0"/>
+                <w:left w:val="none" w:color="auto" w:sz="0" w:space="0"/>
+                <w:bottom w:val="none" w:color="auto" w:sz="0" w:space="0"/>
+                <w:right w:val="none" w:color="auto" w:sz="0" w:space="0"/>
+              </w:pBdr>
+              <w:spacing w:before="40" w:beforeAutospacing="0" w:after="0" w:afterAutospacing="0" w:line="14" w:lineRule="atLeast"/>
+              <w:ind w:left="0" w:right="0"/>
+              <w:rPr>
+                <w:rFonts w:hint="default" w:ascii="Arial" w:hAnsi="Arial" w:cs="Arial"/>
+                <w:sz w:val="21"/>
+                <w:szCs w:val="21"/>
+              </w:rPr>
+            </w:pPr>
+            <w:r>
+              <w:rPr>
+                <w:rFonts w:hint="default" w:ascii="Arial" w:hAnsi="Arial" w:eastAsia="Segoe UI" w:cs="Arial"/>
+                <w:b/>
+                <w:bCs/>
+                <w:i w:val="0"/>
+                <w:iCs w:val="0"/>
+                <w:caps w:val="0"/>
+                <w:color w:val="000000"/>
+                <w:spacing w:val="0"/>
+                <w:sz w:val="20"/>
+                <w:szCs w:val="20"/>
+              </w:rPr>
+              <w:t>Sản phẩm đầu ra: logging_config.py; kiểm tra khả năng phục hồi mạng.</w:t>
+            </w:r>
+          </w:p>
+        </w:tc>
+      </w:tr>
+      <w:tr>
+        <w:tblPrEx>
+          <w:tblBorders>
+            <w:top w:val="single" w:color="auto" w:sz="2" w:space="0"/>
+            <w:left w:val="single" w:color="auto" w:sz="2" w:space="0"/>
+            <w:bottom w:val="single" w:color="auto" w:sz="2" w:space="0"/>
+            <w:right w:val="single" w:color="auto" w:sz="2" w:space="0"/>
+            <w:insideH w:val="none" w:color="auto" w:sz="0" w:space="0"/>
+            <w:insideV w:val="none" w:color="auto" w:sz="0" w:space="0"/>
+          </w:tblBorders>
+          <w:shd w:val="clear" w:color="auto" w:fill="FFFFFF"/>
+          <w:tblCellMar>
+            <w:top w:w="0" w:type="dxa"/>
+            <w:left w:w="0" w:type="dxa"/>
+            <w:bottom w:w="0" w:type="dxa"/>
+            <w:right w:w="0" w:type="dxa"/>
+          </w:tblCellMar>
+        </w:tblPrEx>
+        <w:tc>
+          <w:tcPr>
+            <w:tcW w:w="4147" w:type="dxa"/>
+            <w:tcBorders>
+              <w:top w:val="single" w:color="808080" w:sz="8" w:space="0"/>
+              <w:left w:val="single" w:color="808080" w:sz="8" w:space="0"/>
+              <w:bottom w:val="single" w:color="808080" w:sz="8" w:space="0"/>
+              <w:right w:val="single" w:color="808080" w:sz="8" w:space="0"/>
+            </w:tcBorders>
+            <w:shd w:val="clear" w:color="auto" w:fill="FFFFFF"/>
+            <w:tcMar>
+              <w:left w:w="0" w:type="dxa"/>
+              <w:right w:w="0" w:type="dxa"/>
+            </w:tcMar>
+            <w:vAlign w:val="center"/>
+          </w:tcPr>
+          <w:p>
+            <w:pPr>
+              <w:pStyle w:val="4"/>
+              <w:keepNext w:val="0"/>
+              <w:keepLines w:val="0"/>
+              <w:widowControl/>
+              <w:suppressLineNumbers w:val="0"/>
+              <w:pBdr>
+                <w:top w:val="none" w:color="auto" w:sz="0" w:space="0"/>
+                <w:left w:val="none" w:color="auto" w:sz="0" w:space="0"/>
+                <w:bottom w:val="none" w:color="auto" w:sz="0" w:space="0"/>
+                <w:right w:val="none" w:color="auto" w:sz="0" w:space="0"/>
+              </w:pBdr>
+              <w:spacing w:before="0" w:beforeAutospacing="0" w:after="200" w:afterAutospacing="0" w:line="14" w:lineRule="atLeast"/>
+              <w:ind w:left="0" w:right="0"/>
+              <w:jc w:val="left"/>
+              <w:rPr>
+                <w:rFonts w:hint="default" w:ascii="Arial" w:hAnsi="Arial" w:cs="Arial"/>
+                <w:sz w:val="21"/>
+                <w:szCs w:val="21"/>
+              </w:rPr>
+            </w:pPr>
+            <w:r>
+              <w:rPr>
+                <w:rFonts w:hint="default" w:ascii="Arial" w:hAnsi="Arial" w:eastAsia="Segoe UI" w:cs="Arial"/>
+                <w:b/>
+                <w:bCs/>
+                <w:i w:val="0"/>
+                <w:iCs w:val="0"/>
+                <w:caps w:val="0"/>
+                <w:color w:val="000000"/>
+                <w:spacing w:val="0"/>
+                <w:sz w:val="23"/>
+                <w:szCs w:val="23"/>
+              </w:rPr>
+              <w:t>Trần Ngô Duy Khang</w:t>
+            </w:r>
+          </w:p>
+          <w:p>
+            <w:pPr>
+              <w:pStyle w:val="4"/>
+              <w:keepNext w:val="0"/>
+              <w:keepLines w:val="0"/>
+              <w:widowControl/>
+              <w:suppressLineNumbers w:val="0"/>
+              <w:pBdr>
+                <w:top w:val="none" w:color="auto" w:sz="0" w:space="0"/>
+                <w:left w:val="none" w:color="auto" w:sz="0" w:space="0"/>
+                <w:bottom w:val="none" w:color="auto" w:sz="0" w:space="0"/>
+                <w:right w:val="none" w:color="auto" w:sz="0" w:space="0"/>
+              </w:pBdr>
+              <w:spacing w:before="40" w:beforeAutospacing="0" w:after="0" w:afterAutospacing="0" w:line="14" w:lineRule="atLeast"/>
+              <w:ind w:left="0" w:right="0"/>
+              <w:rPr>
+                <w:rFonts w:hint="default" w:ascii="Arial" w:hAnsi="Arial" w:cs="Arial"/>
+                <w:sz w:val="21"/>
+                <w:szCs w:val="21"/>
+              </w:rPr>
+            </w:pPr>
+            <w:r>
+              <w:rPr>
+                <w:rFonts w:hint="default" w:ascii="Arial" w:hAnsi="Arial" w:eastAsia="Segoe UI" w:cs="Arial"/>
+                <w:i/>
+                <w:iCs/>
+                <w:caps w:val="0"/>
+                <w:color w:val="000000"/>
+                <w:spacing w:val="0"/>
+                <w:sz w:val="19"/>
+                <w:szCs w:val="19"/>
+              </w:rPr>
+              <w:t>(Phát triển GUI)</w:t>
+            </w:r>
+          </w:p>
+        </w:tc>
+        <w:tc>
+          <w:tcPr>
+            <w:tcW w:w="6317" w:type="dxa"/>
+            <w:tcBorders>
+              <w:top w:val="single" w:color="808080" w:sz="8" w:space="0"/>
+              <w:left w:val="single" w:color="808080" w:sz="8" w:space="0"/>
+              <w:bottom w:val="single" w:color="808080" w:sz="8" w:space="0"/>
+              <w:right w:val="single" w:color="808080" w:sz="8" w:space="0"/>
+            </w:tcBorders>
+            <w:shd w:val="clear" w:color="auto" w:fill="FFFFFF"/>
+            <w:tcMar>
+              <w:left w:w="0" w:type="dxa"/>
+              <w:right w:w="0" w:type="dxa"/>
+            </w:tcMar>
+            <w:vAlign w:val="center"/>
+          </w:tcPr>
+          <w:p>
+            <w:pPr>
+              <w:pStyle w:val="4"/>
+              <w:keepNext w:val="0"/>
+              <w:keepLines w:val="0"/>
+              <w:widowControl/>
+              <w:suppressLineNumbers w:val="0"/>
+              <w:pBdr>
+                <w:top w:val="none" w:color="auto" w:sz="0" w:space="0"/>
+                <w:left w:val="none" w:color="auto" w:sz="0" w:space="0"/>
+                <w:bottom w:val="none" w:color="auto" w:sz="0" w:space="0"/>
+                <w:right w:val="none" w:color="auto" w:sz="0" w:space="0"/>
+              </w:pBdr>
+              <w:spacing w:before="0" w:beforeAutospacing="0" w:after="20" w:afterAutospacing="0" w:line="12" w:lineRule="atLeast"/>
+              <w:ind w:left="0" w:right="0"/>
+              <w:rPr>
+                <w:rFonts w:hint="default" w:ascii="Arial" w:hAnsi="Arial" w:cs="Arial"/>
+                <w:sz w:val="21"/>
+                <w:szCs w:val="21"/>
+              </w:rPr>
+            </w:pPr>
+            <w:r>
+              <w:rPr>
+                <w:rFonts w:hint="default" w:ascii="Arial" w:hAnsi="Arial" w:eastAsia="Segoe UI" w:cs="Arial"/>
+                <w:i w:val="0"/>
+                <w:iCs w:val="0"/>
+                <w:caps w:val="0"/>
+                <w:color w:val="000000"/>
+                <w:spacing w:val="0"/>
+                <w:sz w:val="20"/>
+                <w:szCs w:val="20"/>
+              </w:rPr>
+              <w:t>• Thiết kế GUI Cửa sổ chính (Tkinter hoặc PyQt5).</w:t>
+            </w:r>
+          </w:p>
+          <w:p>
+            <w:pPr>
+              <w:pStyle w:val="4"/>
+              <w:keepNext w:val="0"/>
+              <w:keepLines w:val="0"/>
+              <w:widowControl/>
+              <w:suppressLineNumbers w:val="0"/>
+              <w:pBdr>
+                <w:top w:val="none" w:color="auto" w:sz="0" w:space="0"/>
+                <w:left w:val="none" w:color="auto" w:sz="0" w:space="0"/>
+                <w:bottom w:val="none" w:color="auto" w:sz="0" w:space="0"/>
+                <w:right w:val="none" w:color="auto" w:sz="0" w:space="0"/>
+              </w:pBdr>
+              <w:spacing w:before="0" w:beforeAutospacing="0" w:after="20" w:afterAutospacing="0" w:line="12" w:lineRule="atLeast"/>
+              <w:ind w:left="0" w:right="0"/>
+              <w:rPr>
+                <w:rFonts w:hint="default" w:ascii="Arial" w:hAnsi="Arial" w:cs="Arial"/>
+                <w:sz w:val="21"/>
+                <w:szCs w:val="21"/>
+              </w:rPr>
+            </w:pPr>
+            <w:r>
+              <w:rPr>
+                <w:rFonts w:hint="default" w:ascii="Arial" w:hAnsi="Arial" w:eastAsia="Segoe UI" w:cs="Arial"/>
+                <w:i w:val="0"/>
+                <w:iCs w:val="0"/>
+                <w:caps w:val="0"/>
+                <w:color w:val="000000"/>
+                <w:spacing w:val="0"/>
+                <w:sz w:val="20"/>
+                <w:szCs w:val="20"/>
+              </w:rPr>
+              <w:t>• Xây dựng chế độ xem danh sách ngang hàng (danh sách người dùng trực tuyến).</w:t>
+            </w:r>
+          </w:p>
+          <w:p>
+            <w:pPr>
+              <w:pStyle w:val="4"/>
+              <w:keepNext w:val="0"/>
+              <w:keepLines w:val="0"/>
+              <w:widowControl/>
+              <w:suppressLineNumbers w:val="0"/>
+              <w:pBdr>
+                <w:top w:val="none" w:color="auto" w:sz="0" w:space="0"/>
+                <w:left w:val="none" w:color="auto" w:sz="0" w:space="0"/>
+                <w:bottom w:val="none" w:color="auto" w:sz="0" w:space="0"/>
+                <w:right w:val="none" w:color="auto" w:sz="0" w:space="0"/>
+              </w:pBdr>
+              <w:spacing w:before="0" w:beforeAutospacing="0" w:after="20" w:afterAutospacing="0" w:line="12" w:lineRule="atLeast"/>
+              <w:ind w:left="0" w:right="0"/>
+              <w:rPr>
+                <w:rFonts w:hint="default" w:ascii="Arial" w:hAnsi="Arial" w:cs="Arial"/>
+                <w:sz w:val="21"/>
+                <w:szCs w:val="21"/>
+              </w:rPr>
+            </w:pPr>
+            <w:r>
+              <w:rPr>
+                <w:rFonts w:hint="default" w:ascii="Arial" w:hAnsi="Arial" w:eastAsia="Segoe UI" w:cs="Arial"/>
+                <w:i w:val="0"/>
+                <w:iCs w:val="0"/>
+                <w:caps w:val="0"/>
+                <w:color w:val="000000"/>
+                <w:spacing w:val="0"/>
+                <w:sz w:val="20"/>
+                <w:szCs w:val="20"/>
+              </w:rPr>
+              <w:t>• Triển khai cửa sổ trò chuyện (lịch sử tin nhắn, gửi/nhận).</w:t>
+            </w:r>
+          </w:p>
+          <w:p>
+            <w:pPr>
+              <w:pStyle w:val="4"/>
+              <w:keepNext w:val="0"/>
+              <w:keepLines w:val="0"/>
+              <w:widowControl/>
+              <w:suppressLineNumbers w:val="0"/>
+              <w:pBdr>
+                <w:top w:val="none" w:color="auto" w:sz="0" w:space="0"/>
+                <w:left w:val="none" w:color="auto" w:sz="0" w:space="0"/>
+                <w:bottom w:val="none" w:color="auto" w:sz="0" w:space="0"/>
+                <w:right w:val="none" w:color="auto" w:sz="0" w:space="0"/>
+              </w:pBdr>
+              <w:spacing w:before="0" w:beforeAutospacing="0" w:after="20" w:afterAutospacing="0" w:line="12" w:lineRule="atLeast"/>
+              <w:ind w:left="0" w:right="0"/>
+              <w:rPr>
+                <w:rFonts w:hint="default" w:ascii="Arial" w:hAnsi="Arial" w:cs="Arial"/>
+                <w:sz w:val="21"/>
+                <w:szCs w:val="21"/>
+              </w:rPr>
+            </w:pPr>
+            <w:r>
+              <w:rPr>
+                <w:rFonts w:hint="default" w:ascii="Arial" w:hAnsi="Arial" w:eastAsia="Segoe UI" w:cs="Arial"/>
+                <w:i w:val="0"/>
+                <w:iCs w:val="0"/>
+                <w:caps w:val="0"/>
+                <w:color w:val="000000"/>
+                <w:spacing w:val="0"/>
+                <w:sz w:val="20"/>
+                <w:szCs w:val="20"/>
+              </w:rPr>
+              <w:t>• Menu bên và menu điều hướng.</w:t>
+            </w:r>
+          </w:p>
+          <w:p>
+            <w:pPr>
+              <w:pStyle w:val="4"/>
+              <w:keepNext w:val="0"/>
+              <w:keepLines w:val="0"/>
+              <w:widowControl/>
+              <w:suppressLineNumbers w:val="0"/>
+              <w:pBdr>
+                <w:top w:val="none" w:color="auto" w:sz="0" w:space="0"/>
+                <w:left w:val="none" w:color="auto" w:sz="0" w:space="0"/>
+                <w:bottom w:val="none" w:color="auto" w:sz="0" w:space="0"/>
+                <w:right w:val="none" w:color="auto" w:sz="0" w:space="0"/>
+              </w:pBdr>
+              <w:spacing w:before="0" w:beforeAutospacing="0" w:after="20" w:afterAutospacing="0" w:line="12" w:lineRule="atLeast"/>
+              <w:ind w:left="0" w:right="0"/>
+              <w:rPr>
+                <w:rFonts w:hint="default" w:ascii="Arial" w:hAnsi="Arial" w:cs="Arial"/>
+                <w:sz w:val="21"/>
+                <w:szCs w:val="21"/>
+              </w:rPr>
+            </w:pPr>
+            <w:r>
+              <w:rPr>
+                <w:rFonts w:hint="default" w:ascii="Arial" w:hAnsi="Arial" w:eastAsia="Segoe UI" w:cs="Arial"/>
+                <w:i w:val="0"/>
+                <w:iCs w:val="0"/>
+                <w:caps w:val="0"/>
+                <w:color w:val="000000"/>
+                <w:spacing w:val="0"/>
+                <w:sz w:val="20"/>
+                <w:szCs w:val="20"/>
+              </w:rPr>
+              <w:t>• Kết nối các tín hiệu giao diện người dùng (GUI) với phần phụ trợ (node.py).</w:t>
+            </w:r>
+          </w:p>
+          <w:p>
+            <w:pPr>
+              <w:pStyle w:val="4"/>
+              <w:keepNext w:val="0"/>
+              <w:keepLines w:val="0"/>
+              <w:widowControl/>
+              <w:suppressLineNumbers w:val="0"/>
+              <w:pBdr>
+                <w:top w:val="none" w:color="auto" w:sz="0" w:space="0"/>
+                <w:left w:val="none" w:color="auto" w:sz="0" w:space="0"/>
+                <w:bottom w:val="none" w:color="auto" w:sz="0" w:space="0"/>
+                <w:right w:val="none" w:color="auto" w:sz="0" w:space="0"/>
+              </w:pBdr>
+              <w:spacing w:before="40" w:beforeAutospacing="0" w:after="0" w:afterAutospacing="0" w:line="14" w:lineRule="atLeast"/>
+              <w:ind w:left="0" w:right="0"/>
+              <w:rPr>
+                <w:rFonts w:hint="default" w:ascii="Arial" w:hAnsi="Arial" w:cs="Arial"/>
+                <w:sz w:val="21"/>
+                <w:szCs w:val="21"/>
+              </w:rPr>
+            </w:pPr>
+            <w:r>
+              <w:rPr>
+                <w:rFonts w:hint="default" w:ascii="Arial" w:hAnsi="Arial" w:eastAsia="Segoe UI" w:cs="Arial"/>
+                <w:b/>
+                <w:bCs/>
+                <w:i w:val="0"/>
+                <w:iCs w:val="0"/>
+                <w:caps w:val="0"/>
+                <w:color w:val="000000"/>
+                <w:spacing w:val="0"/>
+                <w:sz w:val="20"/>
+                <w:szCs w:val="20"/>
+              </w:rPr>
+              <w:t>Sản phẩm đầu ra: ui/main_window.py; ui/chat_widget.py; ui/peer_list.py.</w:t>
+            </w:r>
+          </w:p>
+        </w:tc>
+      </w:tr>
+      <w:tr>
+        <w:tblPrEx>
+          <w:tblBorders>
+            <w:top w:val="single" w:color="auto" w:sz="2" w:space="0"/>
+            <w:left w:val="single" w:color="auto" w:sz="2" w:space="0"/>
+            <w:bottom w:val="single" w:color="auto" w:sz="2" w:space="0"/>
+            <w:right w:val="single" w:color="auto" w:sz="2" w:space="0"/>
+            <w:insideH w:val="none" w:color="auto" w:sz="0" w:space="0"/>
+            <w:insideV w:val="none" w:color="auto" w:sz="0" w:space="0"/>
+          </w:tblBorders>
+          <w:shd w:val="clear" w:color="auto" w:fill="FFFFFF"/>
+          <w:tblCellMar>
+            <w:top w:w="0" w:type="dxa"/>
+            <w:left w:w="0" w:type="dxa"/>
+            <w:bottom w:w="0" w:type="dxa"/>
+            <w:right w:w="0" w:type="dxa"/>
+          </w:tblCellMar>
+        </w:tblPrEx>
+        <w:tc>
+          <w:tcPr>
+            <w:tcW w:w="4147" w:type="dxa"/>
+            <w:tcBorders>
+              <w:top w:val="single" w:color="808080" w:sz="8" w:space="0"/>
+              <w:left w:val="single" w:color="808080" w:sz="8" w:space="0"/>
+              <w:bottom w:val="single" w:color="808080" w:sz="8" w:space="0"/>
+              <w:right w:val="single" w:color="808080" w:sz="8" w:space="0"/>
+            </w:tcBorders>
+            <w:shd w:val="clear" w:color="auto" w:fill="FFFFFF"/>
+            <w:tcMar>
+              <w:left w:w="0" w:type="dxa"/>
+              <w:right w:w="0" w:type="dxa"/>
+            </w:tcMar>
+            <w:vAlign w:val="center"/>
+          </w:tcPr>
+          <w:p>
+            <w:pPr>
+              <w:pStyle w:val="4"/>
+              <w:keepNext w:val="0"/>
+              <w:keepLines w:val="0"/>
+              <w:widowControl/>
+              <w:suppressLineNumbers w:val="0"/>
+              <w:pBdr>
+                <w:top w:val="none" w:color="auto" w:sz="0" w:space="0"/>
+                <w:left w:val="none" w:color="auto" w:sz="0" w:space="0"/>
+                <w:bottom w:val="none" w:color="auto" w:sz="0" w:space="0"/>
+                <w:right w:val="none" w:color="auto" w:sz="0" w:space="0"/>
+              </w:pBdr>
+              <w:spacing w:before="0" w:beforeAutospacing="0" w:after="200" w:afterAutospacing="0" w:line="14" w:lineRule="atLeast"/>
+              <w:ind w:left="0" w:right="0"/>
+              <w:jc w:val="left"/>
+              <w:rPr>
+                <w:rFonts w:hint="default" w:ascii="Arial" w:hAnsi="Arial" w:cs="Arial"/>
+                <w:sz w:val="21"/>
+                <w:szCs w:val="21"/>
+              </w:rPr>
+            </w:pPr>
+            <w:r>
+              <w:rPr>
+                <w:rFonts w:hint="default" w:ascii="Arial" w:hAnsi="Arial" w:eastAsia="Segoe UI" w:cs="Arial"/>
+                <w:b/>
+                <w:bCs/>
+                <w:i w:val="0"/>
+                <w:iCs w:val="0"/>
+                <w:caps w:val="0"/>
+                <w:color w:val="000000"/>
+                <w:spacing w:val="0"/>
+                <w:sz w:val="23"/>
+                <w:szCs w:val="23"/>
+              </w:rPr>
+              <w:t>Ngủ Hoàng Khang</w:t>
+            </w:r>
+          </w:p>
+          <w:p>
+            <w:pPr>
+              <w:pStyle w:val="4"/>
+              <w:keepNext w:val="0"/>
+              <w:keepLines w:val="0"/>
+              <w:widowControl/>
+              <w:suppressLineNumbers w:val="0"/>
+              <w:pBdr>
+                <w:top w:val="none" w:color="auto" w:sz="0" w:space="0"/>
+                <w:left w:val="none" w:color="auto" w:sz="0" w:space="0"/>
+                <w:bottom w:val="none" w:color="auto" w:sz="0" w:space="0"/>
+                <w:right w:val="none" w:color="auto" w:sz="0" w:space="0"/>
+              </w:pBdr>
+              <w:spacing w:before="40" w:beforeAutospacing="0" w:after="0" w:afterAutospacing="0" w:line="14" w:lineRule="atLeast"/>
+              <w:ind w:left="0" w:right="0"/>
+              <w:rPr>
+                <w:rFonts w:hint="default" w:ascii="Arial" w:hAnsi="Arial" w:cs="Arial"/>
+                <w:sz w:val="21"/>
+                <w:szCs w:val="21"/>
+              </w:rPr>
+            </w:pPr>
+            <w:r>
+              <w:rPr>
+                <w:rFonts w:hint="default" w:ascii="Arial" w:hAnsi="Arial" w:eastAsia="Segoe UI" w:cs="Arial"/>
+                <w:i/>
+                <w:iCs/>
+                <w:caps w:val="0"/>
+                <w:color w:val="000000"/>
+                <w:spacing w:val="0"/>
+                <w:sz w:val="19"/>
+                <w:szCs w:val="19"/>
+              </w:rPr>
+              <w:t>(Truyền Dữ Liệu)</w:t>
+            </w:r>
+          </w:p>
+        </w:tc>
+        <w:tc>
+          <w:tcPr>
+            <w:tcW w:w="6317" w:type="dxa"/>
+            <w:tcBorders>
+              <w:top w:val="single" w:color="808080" w:sz="8" w:space="0"/>
+              <w:left w:val="single" w:color="808080" w:sz="8" w:space="0"/>
+              <w:bottom w:val="single" w:color="808080" w:sz="8" w:space="0"/>
+              <w:right w:val="single" w:color="808080" w:sz="8" w:space="0"/>
+            </w:tcBorders>
+            <w:shd w:val="clear" w:color="auto" w:fill="FFFFFF"/>
+            <w:tcMar>
+              <w:left w:w="0" w:type="dxa"/>
+              <w:right w:w="0" w:type="dxa"/>
+            </w:tcMar>
+            <w:vAlign w:val="center"/>
+          </w:tcPr>
+          <w:p>
+            <w:pPr>
+              <w:pStyle w:val="4"/>
+              <w:keepNext w:val="0"/>
+              <w:keepLines w:val="0"/>
+              <w:widowControl/>
+              <w:suppressLineNumbers w:val="0"/>
+              <w:pBdr>
+                <w:top w:val="none" w:color="auto" w:sz="0" w:space="0"/>
+                <w:left w:val="none" w:color="auto" w:sz="0" w:space="0"/>
+                <w:bottom w:val="none" w:color="auto" w:sz="0" w:space="0"/>
+                <w:right w:val="none" w:color="auto" w:sz="0" w:space="0"/>
+              </w:pBdr>
+              <w:spacing w:before="0" w:beforeAutospacing="0" w:after="20" w:afterAutospacing="0" w:line="12" w:lineRule="atLeast"/>
+              <w:ind w:left="0" w:right="0"/>
+              <w:rPr>
+                <w:rFonts w:hint="default" w:ascii="Arial" w:hAnsi="Arial" w:cs="Arial"/>
+                <w:sz w:val="21"/>
+                <w:szCs w:val="21"/>
+              </w:rPr>
+            </w:pPr>
+            <w:r>
+              <w:rPr>
+                <w:rFonts w:hint="default" w:ascii="Arial" w:hAnsi="Arial" w:eastAsia="Segoe UI" w:cs="Arial"/>
+                <w:i w:val="0"/>
+                <w:iCs w:val="0"/>
+                <w:caps w:val="0"/>
+                <w:color w:val="000000"/>
+                <w:spacing w:val="0"/>
+                <w:sz w:val="20"/>
+                <w:szCs w:val="20"/>
+              </w:rPr>
+              <w:t>• Xây dựng chi tiết Tiền tố độ dài + mã hóa JSON.</w:t>
+            </w:r>
+          </w:p>
+          <w:p>
+            <w:pPr>
+              <w:pStyle w:val="4"/>
+              <w:keepNext w:val="0"/>
+              <w:keepLines w:val="0"/>
+              <w:widowControl/>
+              <w:suppressLineNumbers w:val="0"/>
+              <w:pBdr>
+                <w:top w:val="none" w:color="auto" w:sz="0" w:space="0"/>
+                <w:left w:val="none" w:color="auto" w:sz="0" w:space="0"/>
+                <w:bottom w:val="none" w:color="auto" w:sz="0" w:space="0"/>
+                <w:right w:val="none" w:color="auto" w:sz="0" w:space="0"/>
+              </w:pBdr>
+              <w:spacing w:before="0" w:beforeAutospacing="0" w:after="20" w:afterAutospacing="0" w:line="12" w:lineRule="atLeast"/>
+              <w:ind w:left="0" w:right="0"/>
+              <w:rPr>
+                <w:rFonts w:hint="default" w:ascii="Arial" w:hAnsi="Arial" w:cs="Arial"/>
+                <w:sz w:val="21"/>
+                <w:szCs w:val="21"/>
+              </w:rPr>
+            </w:pPr>
+            <w:r>
+              <w:rPr>
+                <w:rFonts w:hint="default" w:ascii="Arial" w:hAnsi="Arial" w:eastAsia="Segoe UI" w:cs="Arial"/>
+                <w:i w:val="0"/>
+                <w:iCs w:val="0"/>
+                <w:caps w:val="0"/>
+                <w:color w:val="000000"/>
+                <w:spacing w:val="0"/>
+                <w:sz w:val="20"/>
+                <w:szCs w:val="20"/>
+              </w:rPr>
+              <w:t>• Triển khai giao thức tin nhắn văn bản với siêu dữ liệu (dấu thời gian, ID tin nhắn).</w:t>
+            </w:r>
+          </w:p>
+          <w:p>
+            <w:pPr>
+              <w:pStyle w:val="4"/>
+              <w:keepNext w:val="0"/>
+              <w:keepLines w:val="0"/>
+              <w:widowControl/>
+              <w:suppressLineNumbers w:val="0"/>
+              <w:pBdr>
+                <w:top w:val="none" w:color="auto" w:sz="0" w:space="0"/>
+                <w:left w:val="none" w:color="auto" w:sz="0" w:space="0"/>
+                <w:bottom w:val="none" w:color="auto" w:sz="0" w:space="0"/>
+                <w:right w:val="none" w:color="auto" w:sz="0" w:space="0"/>
+              </w:pBdr>
+              <w:spacing w:before="0" w:beforeAutospacing="0" w:after="20" w:afterAutospacing="0" w:line="12" w:lineRule="atLeast"/>
+              <w:ind w:left="0" w:right="0"/>
+              <w:rPr>
+                <w:rFonts w:hint="default" w:ascii="Arial" w:hAnsi="Arial" w:cs="Arial"/>
+                <w:sz w:val="21"/>
+                <w:szCs w:val="21"/>
+              </w:rPr>
+            </w:pPr>
+            <w:r>
+              <w:rPr>
+                <w:rFonts w:hint="default" w:ascii="Arial" w:hAnsi="Arial" w:eastAsia="Segoe UI" w:cs="Arial"/>
+                <w:i w:val="0"/>
+                <w:iCs w:val="0"/>
+                <w:caps w:val="0"/>
+                <w:color w:val="000000"/>
+                <w:spacing w:val="0"/>
+                <w:sz w:val="20"/>
+                <w:szCs w:val="20"/>
+              </w:rPr>
+              <w:t>• Thêm hỗ trợ cho các loại tin nhắn (văn bản, thông báo hệ thống, xác nhận).</w:t>
+            </w:r>
+          </w:p>
+          <w:p>
+            <w:pPr>
+              <w:pStyle w:val="4"/>
+              <w:keepNext w:val="0"/>
+              <w:keepLines w:val="0"/>
+              <w:widowControl/>
+              <w:suppressLineNumbers w:val="0"/>
+              <w:pBdr>
+                <w:top w:val="none" w:color="auto" w:sz="0" w:space="0"/>
+                <w:left w:val="none" w:color="auto" w:sz="0" w:space="0"/>
+                <w:bottom w:val="none" w:color="auto" w:sz="0" w:space="0"/>
+                <w:right w:val="none" w:color="auto" w:sz="0" w:space="0"/>
+              </w:pBdr>
+              <w:spacing w:before="0" w:beforeAutospacing="0" w:after="20" w:afterAutospacing="0" w:line="12" w:lineRule="atLeast"/>
+              <w:ind w:left="0" w:right="0"/>
+              <w:rPr>
+                <w:rFonts w:hint="default" w:ascii="Arial" w:hAnsi="Arial" w:cs="Arial"/>
+                <w:sz w:val="21"/>
+                <w:szCs w:val="21"/>
+              </w:rPr>
+            </w:pPr>
+            <w:r>
+              <w:rPr>
+                <w:rFonts w:hint="default" w:ascii="Arial" w:hAnsi="Arial" w:eastAsia="Segoe UI" w:cs="Arial"/>
+                <w:i w:val="0"/>
+                <w:iCs w:val="0"/>
+                <w:caps w:val="0"/>
+                <w:color w:val="000000"/>
+                <w:spacing w:val="0"/>
+                <w:sz w:val="20"/>
+                <w:szCs w:val="20"/>
+              </w:rPr>
+              <w:t>• Kiểm tra mã hóa/giải mã tin nhắn với các trường hợp ngoại lệ (biểu tượng cảm xúc, ký tự đặc biệt, tin nhắn dài).</w:t>
+            </w:r>
+          </w:p>
+          <w:p>
+            <w:pPr>
+              <w:pStyle w:val="4"/>
+              <w:keepNext w:val="0"/>
+              <w:keepLines w:val="0"/>
+              <w:widowControl/>
+              <w:suppressLineNumbers w:val="0"/>
+              <w:pBdr>
+                <w:top w:val="none" w:color="auto" w:sz="0" w:space="0"/>
+                <w:left w:val="none" w:color="auto" w:sz="0" w:space="0"/>
+                <w:bottom w:val="none" w:color="auto" w:sz="0" w:space="0"/>
+                <w:right w:val="none" w:color="auto" w:sz="0" w:space="0"/>
+              </w:pBdr>
+              <w:spacing w:before="0" w:beforeAutospacing="0" w:after="20" w:afterAutospacing="0" w:line="12" w:lineRule="atLeast"/>
+              <w:ind w:left="0" w:right="0"/>
+              <w:rPr>
+                <w:rFonts w:hint="default" w:ascii="Arial" w:hAnsi="Arial" w:cs="Arial"/>
+                <w:sz w:val="21"/>
+                <w:szCs w:val="21"/>
+              </w:rPr>
+            </w:pPr>
+            <w:r>
+              <w:rPr>
+                <w:rFonts w:hint="default" w:ascii="Arial" w:hAnsi="Arial" w:eastAsia="Segoe UI" w:cs="Arial"/>
+                <w:i w:val="0"/>
+                <w:iCs w:val="0"/>
+                <w:caps w:val="0"/>
+                <w:color w:val="000000"/>
+                <w:spacing w:val="0"/>
+                <w:sz w:val="20"/>
+                <w:szCs w:val="20"/>
+              </w:rPr>
+              <w:t>• Thông số kỹ thuật giao thức tài liệu.</w:t>
+            </w:r>
+          </w:p>
+          <w:p>
+            <w:pPr>
+              <w:pStyle w:val="4"/>
+              <w:keepNext w:val="0"/>
+              <w:keepLines w:val="0"/>
+              <w:widowControl/>
+              <w:suppressLineNumbers w:val="0"/>
+              <w:pBdr>
+                <w:top w:val="none" w:color="auto" w:sz="0" w:space="0"/>
+                <w:left w:val="none" w:color="auto" w:sz="0" w:space="0"/>
+                <w:bottom w:val="none" w:color="auto" w:sz="0" w:space="0"/>
+                <w:right w:val="none" w:color="auto" w:sz="0" w:space="0"/>
+              </w:pBdr>
+              <w:spacing w:before="40" w:beforeAutospacing="0" w:after="0" w:afterAutospacing="0" w:line="14" w:lineRule="atLeast"/>
+              <w:ind w:left="0" w:right="0"/>
+              <w:rPr>
+                <w:rFonts w:hint="default" w:ascii="Arial" w:hAnsi="Arial" w:cs="Arial"/>
+                <w:sz w:val="21"/>
+                <w:szCs w:val="21"/>
+              </w:rPr>
+            </w:pPr>
+            <w:r>
+              <w:rPr>
+                <w:rFonts w:hint="default" w:ascii="Arial" w:hAnsi="Arial" w:eastAsia="Segoe UI" w:cs="Arial"/>
+                <w:b/>
+                <w:bCs/>
+                <w:i w:val="0"/>
+                <w:iCs w:val="0"/>
+                <w:caps w:val="0"/>
+                <w:color w:val="000000"/>
+                <w:spacing w:val="0"/>
+                <w:sz w:val="20"/>
+                <w:szCs w:val="20"/>
+              </w:rPr>
+              <w:t>Sản phẩm bàn giao: protocol.py các cải tiến; tài liệu đặc tả giao thức.</w:t>
+            </w:r>
+          </w:p>
+        </w:tc>
+      </w:tr>
+      <w:tr>
+        <w:tblPrEx>
+          <w:tblBorders>
+            <w:top w:val="single" w:color="auto" w:sz="2" w:space="0"/>
+            <w:left w:val="single" w:color="auto" w:sz="2" w:space="0"/>
+            <w:bottom w:val="single" w:color="auto" w:sz="2" w:space="0"/>
+            <w:right w:val="single" w:color="auto" w:sz="2" w:space="0"/>
+            <w:insideH w:val="none" w:color="auto" w:sz="0" w:space="0"/>
+            <w:insideV w:val="none" w:color="auto" w:sz="0" w:space="0"/>
+          </w:tblBorders>
+          <w:shd w:val="clear" w:color="auto" w:fill="FFFFFF"/>
+          <w:tblCellMar>
+            <w:top w:w="0" w:type="dxa"/>
+            <w:left w:w="0" w:type="dxa"/>
+            <w:bottom w:w="0" w:type="dxa"/>
+            <w:right w:w="0" w:type="dxa"/>
+          </w:tblCellMar>
+        </w:tblPrEx>
+        <w:tc>
+          <w:tcPr>
+            <w:tcW w:w="4147" w:type="dxa"/>
+            <w:tcBorders>
+              <w:top w:val="single" w:color="808080" w:sz="8" w:space="0"/>
+              <w:left w:val="single" w:color="808080" w:sz="8" w:space="0"/>
+              <w:bottom w:val="single" w:color="808080" w:sz="8" w:space="0"/>
+              <w:right w:val="single" w:color="808080" w:sz="8" w:space="0"/>
+            </w:tcBorders>
+            <w:shd w:val="clear" w:color="auto" w:fill="FFFFFF"/>
+            <w:tcMar>
+              <w:left w:w="0" w:type="dxa"/>
+              <w:right w:w="0" w:type="dxa"/>
+            </w:tcMar>
+            <w:vAlign w:val="center"/>
+          </w:tcPr>
+          <w:p>
+            <w:pPr>
+              <w:pStyle w:val="4"/>
+              <w:keepNext w:val="0"/>
+              <w:keepLines w:val="0"/>
+              <w:widowControl/>
+              <w:suppressLineNumbers w:val="0"/>
+              <w:pBdr>
+                <w:top w:val="none" w:color="auto" w:sz="0" w:space="0"/>
+                <w:left w:val="none" w:color="auto" w:sz="0" w:space="0"/>
+                <w:bottom w:val="none" w:color="auto" w:sz="0" w:space="0"/>
+                <w:right w:val="none" w:color="auto" w:sz="0" w:space="0"/>
+              </w:pBdr>
+              <w:spacing w:before="0" w:beforeAutospacing="0" w:after="200" w:afterAutospacing="0" w:line="14" w:lineRule="atLeast"/>
+              <w:ind w:left="0" w:right="0"/>
+              <w:jc w:val="left"/>
+              <w:rPr>
+                <w:rFonts w:hint="default" w:ascii="Arial" w:hAnsi="Arial" w:cs="Arial"/>
+                <w:sz w:val="21"/>
+                <w:szCs w:val="21"/>
+              </w:rPr>
+            </w:pPr>
+            <w:r>
+              <w:rPr>
+                <w:rFonts w:hint="default" w:ascii="Arial" w:hAnsi="Arial" w:eastAsia="Segoe UI" w:cs="Arial"/>
+                <w:b/>
+                <w:bCs/>
+                <w:i w:val="0"/>
+                <w:iCs w:val="0"/>
+                <w:caps w:val="0"/>
+                <w:color w:val="000000"/>
+                <w:spacing w:val="0"/>
+                <w:sz w:val="23"/>
+                <w:szCs w:val="23"/>
+              </w:rPr>
+              <w:t>Nguyễn Thanh Khánh</w:t>
+            </w:r>
+          </w:p>
+          <w:p>
+            <w:pPr>
+              <w:pStyle w:val="4"/>
+              <w:keepNext w:val="0"/>
+              <w:keepLines w:val="0"/>
+              <w:widowControl/>
+              <w:suppressLineNumbers w:val="0"/>
+              <w:pBdr>
+                <w:top w:val="none" w:color="auto" w:sz="0" w:space="0"/>
+                <w:left w:val="none" w:color="auto" w:sz="0" w:space="0"/>
+                <w:bottom w:val="none" w:color="auto" w:sz="0" w:space="0"/>
+                <w:right w:val="none" w:color="auto" w:sz="0" w:space="0"/>
+              </w:pBdr>
+              <w:spacing w:before="40" w:beforeAutospacing="0" w:after="0" w:afterAutospacing="0" w:line="14" w:lineRule="atLeast"/>
+              <w:ind w:left="0" w:right="0"/>
+              <w:rPr>
+                <w:rFonts w:hint="default" w:ascii="Arial" w:hAnsi="Arial" w:cs="Arial"/>
+                <w:sz w:val="21"/>
+                <w:szCs w:val="21"/>
+              </w:rPr>
+            </w:pPr>
+            <w:r>
+              <w:rPr>
+                <w:rFonts w:hint="default" w:ascii="Arial" w:hAnsi="Arial" w:eastAsia="Segoe UI" w:cs="Arial"/>
+                <w:i/>
+                <w:iCs/>
+                <w:caps w:val="0"/>
+                <w:color w:val="000000"/>
+                <w:spacing w:val="0"/>
+                <w:sz w:val="19"/>
+                <w:szCs w:val="19"/>
+              </w:rPr>
+              <w:t>(Mã hóa/Bảo mật)</w:t>
+            </w:r>
+          </w:p>
+        </w:tc>
+        <w:tc>
+          <w:tcPr>
+            <w:tcW w:w="6317" w:type="dxa"/>
+            <w:tcBorders>
+              <w:top w:val="single" w:color="808080" w:sz="8" w:space="0"/>
+              <w:left w:val="single" w:color="808080" w:sz="8" w:space="0"/>
+              <w:bottom w:val="single" w:color="808080" w:sz="8" w:space="0"/>
+              <w:right w:val="single" w:color="808080" w:sz="8" w:space="0"/>
+            </w:tcBorders>
+            <w:shd w:val="clear" w:color="auto" w:fill="FFFFFF"/>
+            <w:tcMar>
+              <w:left w:w="0" w:type="dxa"/>
+              <w:right w:w="0" w:type="dxa"/>
+            </w:tcMar>
+            <w:vAlign w:val="center"/>
+          </w:tcPr>
+          <w:p>
+            <w:pPr>
+              <w:pStyle w:val="4"/>
+              <w:keepNext w:val="0"/>
+              <w:keepLines w:val="0"/>
+              <w:widowControl/>
+              <w:suppressLineNumbers w:val="0"/>
+              <w:pBdr>
+                <w:top w:val="none" w:color="auto" w:sz="0" w:space="0"/>
+                <w:left w:val="none" w:color="auto" w:sz="0" w:space="0"/>
+                <w:bottom w:val="none" w:color="auto" w:sz="0" w:space="0"/>
+                <w:right w:val="none" w:color="auto" w:sz="0" w:space="0"/>
+              </w:pBdr>
+              <w:spacing w:before="0" w:beforeAutospacing="0" w:after="20" w:afterAutospacing="0" w:line="12" w:lineRule="atLeast"/>
+              <w:ind w:left="0" w:right="0"/>
+              <w:rPr>
+                <w:rFonts w:hint="default" w:ascii="Arial" w:hAnsi="Arial" w:cs="Arial"/>
+                <w:sz w:val="21"/>
+                <w:szCs w:val="21"/>
+              </w:rPr>
+            </w:pPr>
+            <w:r>
+              <w:rPr>
+                <w:rFonts w:hint="default" w:ascii="Arial" w:hAnsi="Arial" w:eastAsia="Segoe UI" w:cs="Arial"/>
+                <w:i w:val="0"/>
+                <w:iCs w:val="0"/>
+                <w:caps w:val="0"/>
+                <w:color w:val="000000"/>
+                <w:spacing w:val="0"/>
+                <w:sz w:val="20"/>
+                <w:szCs w:val="20"/>
+              </w:rPr>
+              <w:t>• Triển khai RSA + Fernet từ đầu đến cuối (cải tiến handshake.py).</w:t>
+            </w:r>
+          </w:p>
+          <w:p>
+            <w:pPr>
+              <w:pStyle w:val="4"/>
+              <w:keepNext w:val="0"/>
+              <w:keepLines w:val="0"/>
+              <w:widowControl/>
+              <w:suppressLineNumbers w:val="0"/>
+              <w:pBdr>
+                <w:top w:val="none" w:color="auto" w:sz="0" w:space="0"/>
+                <w:left w:val="none" w:color="auto" w:sz="0" w:space="0"/>
+                <w:bottom w:val="none" w:color="auto" w:sz="0" w:space="0"/>
+                <w:right w:val="none" w:color="auto" w:sz="0" w:space="0"/>
+              </w:pBdr>
+              <w:spacing w:before="0" w:beforeAutospacing="0" w:after="20" w:afterAutospacing="0" w:line="12" w:lineRule="atLeast"/>
+              <w:ind w:left="0" w:right="0"/>
+              <w:rPr>
+                <w:rFonts w:hint="default" w:ascii="Arial" w:hAnsi="Arial" w:cs="Arial"/>
+                <w:sz w:val="21"/>
+                <w:szCs w:val="21"/>
+              </w:rPr>
+            </w:pPr>
+            <w:r>
+              <w:rPr>
+                <w:rFonts w:hint="default" w:ascii="Arial" w:hAnsi="Arial" w:eastAsia="Segoe UI" w:cs="Arial"/>
+                <w:i w:val="0"/>
+                <w:iCs w:val="0"/>
+                <w:caps w:val="0"/>
+                <w:color w:val="000000"/>
+                <w:spacing w:val="0"/>
+                <w:sz w:val="20"/>
+                <w:szCs w:val="20"/>
+              </w:rPr>
+              <w:t>• Thêm tính năng ký tin nhắn (xác minh chữ ký RSA).</w:t>
+            </w:r>
+          </w:p>
+          <w:p>
+            <w:pPr>
+              <w:pStyle w:val="4"/>
+              <w:keepNext w:val="0"/>
+              <w:keepLines w:val="0"/>
+              <w:widowControl/>
+              <w:suppressLineNumbers w:val="0"/>
+              <w:pBdr>
+                <w:top w:val="none" w:color="auto" w:sz="0" w:space="0"/>
+                <w:left w:val="none" w:color="auto" w:sz="0" w:space="0"/>
+                <w:bottom w:val="none" w:color="auto" w:sz="0" w:space="0"/>
+                <w:right w:val="none" w:color="auto" w:sz="0" w:space="0"/>
+              </w:pBdr>
+              <w:spacing w:before="0" w:beforeAutospacing="0" w:after="20" w:afterAutospacing="0" w:line="12" w:lineRule="atLeast"/>
+              <w:ind w:left="0" w:right="0"/>
+              <w:rPr>
+                <w:rFonts w:hint="default" w:ascii="Arial" w:hAnsi="Arial" w:cs="Arial"/>
+                <w:sz w:val="21"/>
+                <w:szCs w:val="21"/>
+              </w:rPr>
+            </w:pPr>
+            <w:r>
+              <w:rPr>
+                <w:rFonts w:hint="default" w:ascii="Arial" w:hAnsi="Arial" w:eastAsia="Segoe UI" w:cs="Arial"/>
+                <w:i w:val="0"/>
+                <w:iCs w:val="0"/>
+                <w:caps w:val="0"/>
+                <w:color w:val="000000"/>
+                <w:spacing w:val="0"/>
+                <w:sz w:val="20"/>
+                <w:szCs w:val="20"/>
+              </w:rPr>
+              <w:t>• Triển khai mã hóa truyền tải tập tin (chỗ giữ chỗ cho Sprint 3).</w:t>
+            </w:r>
+          </w:p>
+          <w:p>
+            <w:pPr>
+              <w:pStyle w:val="4"/>
+              <w:keepNext w:val="0"/>
+              <w:keepLines w:val="0"/>
+              <w:widowControl/>
+              <w:suppressLineNumbers w:val="0"/>
+              <w:pBdr>
+                <w:top w:val="none" w:color="auto" w:sz="0" w:space="0"/>
+                <w:left w:val="none" w:color="auto" w:sz="0" w:space="0"/>
+                <w:bottom w:val="none" w:color="auto" w:sz="0" w:space="0"/>
+                <w:right w:val="none" w:color="auto" w:sz="0" w:space="0"/>
+              </w:pBdr>
+              <w:spacing w:before="0" w:beforeAutospacing="0" w:after="20" w:afterAutospacing="0" w:line="12" w:lineRule="atLeast"/>
+              <w:ind w:left="0" w:right="0"/>
+              <w:rPr>
+                <w:rFonts w:hint="default" w:ascii="Arial" w:hAnsi="Arial" w:cs="Arial"/>
+                <w:sz w:val="21"/>
+                <w:szCs w:val="21"/>
+              </w:rPr>
+            </w:pPr>
+            <w:r>
+              <w:rPr>
+                <w:rFonts w:hint="default" w:ascii="Arial" w:hAnsi="Arial" w:eastAsia="Segoe UI" w:cs="Arial"/>
+                <w:i w:val="0"/>
+                <w:iCs w:val="0"/>
+                <w:caps w:val="0"/>
+                <w:color w:val="000000"/>
+                <w:spacing w:val="0"/>
+                <w:sz w:val="20"/>
+                <w:szCs w:val="20"/>
+              </w:rPr>
+              <w:t>• Kiểm tra bảo mật: kiểm tra xem có khóa mã hóa cứng nào không.</w:t>
+            </w:r>
+          </w:p>
+          <w:p>
+            <w:pPr>
+              <w:pStyle w:val="4"/>
+              <w:keepNext w:val="0"/>
+              <w:keepLines w:val="0"/>
+              <w:widowControl/>
+              <w:suppressLineNumbers w:val="0"/>
+              <w:pBdr>
+                <w:top w:val="none" w:color="auto" w:sz="0" w:space="0"/>
+                <w:left w:val="none" w:color="auto" w:sz="0" w:space="0"/>
+                <w:bottom w:val="none" w:color="auto" w:sz="0" w:space="0"/>
+                <w:right w:val="none" w:color="auto" w:sz="0" w:space="0"/>
+              </w:pBdr>
+              <w:spacing w:before="0" w:beforeAutospacing="0" w:after="20" w:afterAutospacing="0" w:line="12" w:lineRule="atLeast"/>
+              <w:ind w:left="0" w:right="0"/>
+              <w:rPr>
+                <w:rFonts w:hint="default" w:ascii="Arial" w:hAnsi="Arial" w:cs="Arial"/>
+                <w:sz w:val="21"/>
+                <w:szCs w:val="21"/>
+              </w:rPr>
+            </w:pPr>
+            <w:r>
+              <w:rPr>
+                <w:rFonts w:hint="default" w:ascii="Arial" w:hAnsi="Arial" w:eastAsia="Segoe UI" w:cs="Arial"/>
+                <w:i w:val="0"/>
+                <w:iCs w:val="0"/>
+                <w:caps w:val="0"/>
+                <w:color w:val="000000"/>
+                <w:spacing w:val="0"/>
+                <w:sz w:val="20"/>
+                <w:szCs w:val="20"/>
+              </w:rPr>
+              <w:t>• Thêm tùy chọn xác minh vân tay.</w:t>
+            </w:r>
+          </w:p>
+          <w:p>
+            <w:pPr>
+              <w:pStyle w:val="4"/>
+              <w:keepNext w:val="0"/>
+              <w:keepLines w:val="0"/>
+              <w:widowControl/>
+              <w:suppressLineNumbers w:val="0"/>
+              <w:pBdr>
+                <w:top w:val="none" w:color="auto" w:sz="0" w:space="0"/>
+                <w:left w:val="none" w:color="auto" w:sz="0" w:space="0"/>
+                <w:bottom w:val="none" w:color="auto" w:sz="0" w:space="0"/>
+                <w:right w:val="none" w:color="auto" w:sz="0" w:space="0"/>
+              </w:pBdr>
+              <w:spacing w:before="40" w:beforeAutospacing="0" w:after="0" w:afterAutospacing="0" w:line="14" w:lineRule="atLeast"/>
+              <w:ind w:left="0" w:right="0"/>
+              <w:rPr>
+                <w:rFonts w:hint="default" w:ascii="Arial" w:hAnsi="Arial" w:cs="Arial"/>
+                <w:sz w:val="21"/>
+                <w:szCs w:val="21"/>
+              </w:rPr>
+            </w:pPr>
+            <w:r>
+              <w:rPr>
+                <w:rFonts w:hint="default" w:ascii="Arial" w:hAnsi="Arial" w:eastAsia="Segoe UI" w:cs="Arial"/>
+                <w:b/>
+                <w:bCs/>
+                <w:i w:val="0"/>
+                <w:iCs w:val="0"/>
+                <w:caps w:val="0"/>
+                <w:color w:val="000000"/>
+                <w:spacing w:val="0"/>
+                <w:sz w:val="20"/>
+                <w:szCs w:val="20"/>
+              </w:rPr>
+              <w:t>Sản phẩm đầu ra: handshake.py được cải tiến; tài liệu đánh giá bảo mật.</w:t>
+            </w:r>
+          </w:p>
+        </w:tc>
+      </w:tr>
+      <w:tr>
+        <w:tblPrEx>
+          <w:tblBorders>
+            <w:top w:val="single" w:color="auto" w:sz="2" w:space="0"/>
+            <w:left w:val="single" w:color="auto" w:sz="2" w:space="0"/>
+            <w:bottom w:val="single" w:color="auto" w:sz="2" w:space="0"/>
+            <w:right w:val="single" w:color="auto" w:sz="2" w:space="0"/>
+            <w:insideH w:val="none" w:color="auto" w:sz="0" w:space="0"/>
+            <w:insideV w:val="none" w:color="auto" w:sz="0" w:space="0"/>
+          </w:tblBorders>
+          <w:shd w:val="clear" w:color="auto" w:fill="FFFFFF"/>
+          <w:tblCellMar>
+            <w:top w:w="0" w:type="dxa"/>
+            <w:left w:w="0" w:type="dxa"/>
+            <w:bottom w:w="0" w:type="dxa"/>
+            <w:right w:w="0" w:type="dxa"/>
+          </w:tblCellMar>
+        </w:tblPrEx>
+        <w:tc>
+          <w:tcPr>
+            <w:tcW w:w="4147" w:type="dxa"/>
+            <w:tcBorders>
+              <w:top w:val="single" w:color="808080" w:sz="8" w:space="0"/>
+              <w:left w:val="single" w:color="808080" w:sz="8" w:space="0"/>
+              <w:bottom w:val="single" w:color="808080" w:sz="8" w:space="0"/>
+              <w:right w:val="single" w:color="808080" w:sz="8" w:space="0"/>
+            </w:tcBorders>
+            <w:shd w:val="clear" w:color="auto" w:fill="FFFFFF"/>
+            <w:tcMar>
+              <w:left w:w="0" w:type="dxa"/>
+              <w:right w:w="0" w:type="dxa"/>
+            </w:tcMar>
+            <w:vAlign w:val="center"/>
+          </w:tcPr>
+          <w:p>
+            <w:pPr>
+              <w:pStyle w:val="4"/>
+              <w:keepNext w:val="0"/>
+              <w:keepLines w:val="0"/>
+              <w:widowControl/>
+              <w:suppressLineNumbers w:val="0"/>
+              <w:pBdr>
+                <w:top w:val="none" w:color="auto" w:sz="0" w:space="0"/>
+                <w:left w:val="none" w:color="auto" w:sz="0" w:space="0"/>
+                <w:bottom w:val="none" w:color="auto" w:sz="0" w:space="0"/>
+                <w:right w:val="none" w:color="auto" w:sz="0" w:space="0"/>
+              </w:pBdr>
+              <w:spacing w:before="0" w:beforeAutospacing="0" w:after="200" w:afterAutospacing="0" w:line="14" w:lineRule="atLeast"/>
+              <w:ind w:left="0" w:right="0"/>
+              <w:jc w:val="left"/>
+              <w:rPr>
+                <w:rFonts w:hint="default" w:ascii="Arial" w:hAnsi="Arial" w:cs="Arial"/>
+                <w:sz w:val="21"/>
+                <w:szCs w:val="21"/>
+              </w:rPr>
+            </w:pPr>
+            <w:r>
+              <w:rPr>
+                <w:rFonts w:hint="default" w:ascii="Arial" w:hAnsi="Arial" w:eastAsia="Segoe UI" w:cs="Arial"/>
+                <w:b/>
+                <w:bCs/>
+                <w:i w:val="0"/>
+                <w:iCs w:val="0"/>
+                <w:caps w:val="0"/>
+                <w:color w:val="000000"/>
+                <w:spacing w:val="0"/>
+                <w:sz w:val="23"/>
+                <w:szCs w:val="23"/>
+              </w:rPr>
+              <w:t>Lương Quốc Khánh</w:t>
+            </w:r>
+          </w:p>
+          <w:p>
+            <w:pPr>
+              <w:pStyle w:val="4"/>
+              <w:keepNext w:val="0"/>
+              <w:keepLines w:val="0"/>
+              <w:widowControl/>
+              <w:suppressLineNumbers w:val="0"/>
+              <w:pBdr>
+                <w:top w:val="none" w:color="auto" w:sz="0" w:space="0"/>
+                <w:left w:val="none" w:color="auto" w:sz="0" w:space="0"/>
+                <w:bottom w:val="none" w:color="auto" w:sz="0" w:space="0"/>
+                <w:right w:val="none" w:color="auto" w:sz="0" w:space="0"/>
+              </w:pBdr>
+              <w:spacing w:before="40" w:beforeAutospacing="0" w:after="0" w:afterAutospacing="0" w:line="14" w:lineRule="atLeast"/>
+              <w:ind w:left="0" w:right="0"/>
+              <w:rPr>
+                <w:rFonts w:hint="default" w:ascii="Arial" w:hAnsi="Arial" w:cs="Arial"/>
+                <w:sz w:val="21"/>
+                <w:szCs w:val="21"/>
+              </w:rPr>
+            </w:pPr>
+            <w:r>
+              <w:rPr>
+                <w:rFonts w:hint="default" w:ascii="Arial" w:hAnsi="Arial" w:eastAsia="Segoe UI" w:cs="Arial"/>
+                <w:i/>
+                <w:iCs/>
+                <w:caps w:val="0"/>
+                <w:color w:val="000000"/>
+                <w:spacing w:val="0"/>
+                <w:sz w:val="19"/>
+                <w:szCs w:val="19"/>
+              </w:rPr>
+              <w:t>(Testing - QA)</w:t>
+            </w:r>
+          </w:p>
+        </w:tc>
+        <w:tc>
+          <w:tcPr>
+            <w:tcW w:w="6317" w:type="dxa"/>
+            <w:tcBorders>
+              <w:top w:val="single" w:color="808080" w:sz="8" w:space="0"/>
+              <w:left w:val="single" w:color="808080" w:sz="8" w:space="0"/>
+              <w:bottom w:val="single" w:color="808080" w:sz="8" w:space="0"/>
+              <w:right w:val="single" w:color="808080" w:sz="8" w:space="0"/>
+            </w:tcBorders>
+            <w:shd w:val="clear" w:color="auto" w:fill="FFFFFF"/>
+            <w:tcMar>
+              <w:left w:w="0" w:type="dxa"/>
+              <w:right w:w="0" w:type="dxa"/>
+            </w:tcMar>
+            <w:vAlign w:val="center"/>
+          </w:tcPr>
+          <w:p>
+            <w:pPr>
+              <w:pStyle w:val="4"/>
+              <w:keepNext w:val="0"/>
+              <w:keepLines w:val="0"/>
+              <w:widowControl/>
+              <w:suppressLineNumbers w:val="0"/>
+              <w:pBdr>
+                <w:top w:val="none" w:color="auto" w:sz="0" w:space="0"/>
+                <w:left w:val="none" w:color="auto" w:sz="0" w:space="0"/>
+                <w:bottom w:val="none" w:color="auto" w:sz="0" w:space="0"/>
+                <w:right w:val="none" w:color="auto" w:sz="0" w:space="0"/>
+              </w:pBdr>
+              <w:spacing w:before="0" w:beforeAutospacing="0" w:after="20" w:afterAutospacing="0" w:line="12" w:lineRule="atLeast"/>
+              <w:ind w:left="0" w:right="0"/>
+              <w:rPr>
+                <w:rFonts w:hint="default" w:ascii="Arial" w:hAnsi="Arial" w:cs="Arial"/>
+                <w:sz w:val="21"/>
+                <w:szCs w:val="21"/>
+              </w:rPr>
+            </w:pPr>
+            <w:r>
+              <w:rPr>
+                <w:rFonts w:hint="default" w:ascii="Arial" w:hAnsi="Arial" w:eastAsia="Segoe UI" w:cs="Arial"/>
+                <w:i w:val="0"/>
+                <w:iCs w:val="0"/>
+                <w:caps w:val="0"/>
+                <w:color w:val="000000"/>
+                <w:spacing w:val="0"/>
+                <w:sz w:val="20"/>
+                <w:szCs w:val="20"/>
+              </w:rPr>
+              <w:t>• Viết các bài kiểm thử đơn vị cho giao thức (tất cả các loại thông báo).</w:t>
+            </w:r>
+          </w:p>
+          <w:p>
+            <w:pPr>
+              <w:pStyle w:val="4"/>
+              <w:keepNext w:val="0"/>
+              <w:keepLines w:val="0"/>
+              <w:widowControl/>
+              <w:suppressLineNumbers w:val="0"/>
+              <w:pBdr>
+                <w:top w:val="none" w:color="auto" w:sz="0" w:space="0"/>
+                <w:left w:val="none" w:color="auto" w:sz="0" w:space="0"/>
+                <w:bottom w:val="none" w:color="auto" w:sz="0" w:space="0"/>
+                <w:right w:val="none" w:color="auto" w:sz="0" w:space="0"/>
+              </w:pBdr>
+              <w:spacing w:before="0" w:beforeAutospacing="0" w:after="20" w:afterAutospacing="0" w:line="12" w:lineRule="atLeast"/>
+              <w:ind w:left="0" w:right="0"/>
+              <w:rPr>
+                <w:rFonts w:hint="default" w:ascii="Arial" w:hAnsi="Arial" w:cs="Arial"/>
+                <w:sz w:val="21"/>
+                <w:szCs w:val="21"/>
+              </w:rPr>
+            </w:pPr>
+            <w:r>
+              <w:rPr>
+                <w:rFonts w:hint="default" w:ascii="Arial" w:hAnsi="Arial" w:eastAsia="Segoe UI" w:cs="Arial"/>
+                <w:i w:val="0"/>
+                <w:iCs w:val="0"/>
+                <w:caps w:val="0"/>
+                <w:color w:val="000000"/>
+                <w:spacing w:val="0"/>
+                <w:sz w:val="20"/>
+                <w:szCs w:val="20"/>
+              </w:rPr>
+              <w:t>• Viết các bài kiểm thử tích hợp (giao tiếp giữa máy khách và máy chủ).</w:t>
+            </w:r>
+          </w:p>
+          <w:p>
+            <w:pPr>
+              <w:pStyle w:val="4"/>
+              <w:keepNext w:val="0"/>
+              <w:keepLines w:val="0"/>
+              <w:widowControl/>
+              <w:suppressLineNumbers w:val="0"/>
+              <w:pBdr>
+                <w:top w:val="none" w:color="auto" w:sz="0" w:space="0"/>
+                <w:left w:val="none" w:color="auto" w:sz="0" w:space="0"/>
+                <w:bottom w:val="none" w:color="auto" w:sz="0" w:space="0"/>
+                <w:right w:val="none" w:color="auto" w:sz="0" w:space="0"/>
+              </w:pBdr>
+              <w:spacing w:before="0" w:beforeAutospacing="0" w:after="20" w:afterAutospacing="0" w:line="12" w:lineRule="atLeast"/>
+              <w:ind w:left="0" w:right="0"/>
+              <w:rPr>
+                <w:rFonts w:hint="default" w:ascii="Arial" w:hAnsi="Arial" w:cs="Arial"/>
+                <w:sz w:val="21"/>
+                <w:szCs w:val="21"/>
+              </w:rPr>
+            </w:pPr>
+            <w:r>
+              <w:rPr>
+                <w:rFonts w:hint="default" w:ascii="Arial" w:hAnsi="Arial" w:eastAsia="Segoe UI" w:cs="Arial"/>
+                <w:i w:val="0"/>
+                <w:iCs w:val="0"/>
+                <w:caps w:val="0"/>
+                <w:color w:val="000000"/>
+                <w:spacing w:val="0"/>
+                <w:sz w:val="20"/>
+                <w:szCs w:val="20"/>
+              </w:rPr>
+              <w:t>• Kiểm tra khả năng chịu tải: 10+ máy khách đồng thời.</w:t>
+            </w:r>
+          </w:p>
+          <w:p>
+            <w:pPr>
+              <w:pStyle w:val="4"/>
+              <w:keepNext w:val="0"/>
+              <w:keepLines w:val="0"/>
+              <w:widowControl/>
+              <w:suppressLineNumbers w:val="0"/>
+              <w:pBdr>
+                <w:top w:val="none" w:color="auto" w:sz="0" w:space="0"/>
+                <w:left w:val="none" w:color="auto" w:sz="0" w:space="0"/>
+                <w:bottom w:val="none" w:color="auto" w:sz="0" w:space="0"/>
+                <w:right w:val="none" w:color="auto" w:sz="0" w:space="0"/>
+              </w:pBdr>
+              <w:spacing w:before="0" w:beforeAutospacing="0" w:after="20" w:afterAutospacing="0" w:line="12" w:lineRule="atLeast"/>
+              <w:ind w:left="0" w:right="0"/>
+              <w:rPr>
+                <w:rFonts w:hint="default" w:ascii="Arial" w:hAnsi="Arial" w:cs="Arial"/>
+                <w:sz w:val="21"/>
+                <w:szCs w:val="21"/>
+              </w:rPr>
+            </w:pPr>
+            <w:r>
+              <w:rPr>
+                <w:rFonts w:hint="default" w:ascii="Arial" w:hAnsi="Arial" w:eastAsia="Segoe UI" w:cs="Arial"/>
+                <w:i w:val="0"/>
+                <w:iCs w:val="0"/>
+                <w:caps w:val="0"/>
+                <w:color w:val="000000"/>
+                <w:spacing w:val="0"/>
+                <w:sz w:val="20"/>
+                <w:szCs w:val="20"/>
+              </w:rPr>
+              <w:t>• Kiểm tra hiệu năng: thông lượng tin nhắn, độ trễ.</w:t>
+            </w:r>
+          </w:p>
+          <w:p>
+            <w:pPr>
+              <w:pStyle w:val="4"/>
+              <w:keepNext w:val="0"/>
+              <w:keepLines w:val="0"/>
+              <w:widowControl/>
+              <w:suppressLineNumbers w:val="0"/>
+              <w:pBdr>
+                <w:top w:val="none" w:color="auto" w:sz="0" w:space="0"/>
+                <w:left w:val="none" w:color="auto" w:sz="0" w:space="0"/>
+                <w:bottom w:val="none" w:color="auto" w:sz="0" w:space="0"/>
+                <w:right w:val="none" w:color="auto" w:sz="0" w:space="0"/>
+              </w:pBdr>
+              <w:spacing w:before="0" w:beforeAutospacing="0" w:after="20" w:afterAutospacing="0" w:line="12" w:lineRule="atLeast"/>
+              <w:ind w:left="0" w:right="0"/>
+              <w:rPr>
+                <w:rFonts w:hint="default" w:ascii="Arial" w:hAnsi="Arial" w:cs="Arial"/>
+                <w:sz w:val="21"/>
+                <w:szCs w:val="21"/>
+              </w:rPr>
+            </w:pPr>
+            <w:r>
+              <w:rPr>
+                <w:rFonts w:hint="default" w:ascii="Arial" w:hAnsi="Arial" w:eastAsia="Segoe UI" w:cs="Arial"/>
+                <w:i w:val="0"/>
+                <w:iCs w:val="0"/>
+                <w:caps w:val="0"/>
+                <w:color w:val="000000"/>
+                <w:spacing w:val="0"/>
+                <w:sz w:val="20"/>
+                <w:szCs w:val="20"/>
+              </w:rPr>
+              <w:t>• Kiểm tra tắt máy an toàn và phục hồi lỗi.</w:t>
+            </w:r>
+          </w:p>
+          <w:p>
+            <w:pPr>
+              <w:pStyle w:val="4"/>
+              <w:keepNext w:val="0"/>
+              <w:keepLines w:val="0"/>
+              <w:widowControl/>
+              <w:suppressLineNumbers w:val="0"/>
+              <w:pBdr>
+                <w:top w:val="none" w:color="auto" w:sz="0" w:space="0"/>
+                <w:left w:val="none" w:color="auto" w:sz="0" w:space="0"/>
+                <w:bottom w:val="none" w:color="auto" w:sz="0" w:space="0"/>
+                <w:right w:val="none" w:color="auto" w:sz="0" w:space="0"/>
+              </w:pBdr>
+              <w:spacing w:before="0" w:beforeAutospacing="0" w:after="20" w:afterAutospacing="0" w:line="12" w:lineRule="atLeast"/>
+              <w:ind w:left="0" w:right="0"/>
+              <w:rPr>
+                <w:rFonts w:hint="default" w:ascii="Arial" w:hAnsi="Arial" w:cs="Arial"/>
+                <w:sz w:val="21"/>
+                <w:szCs w:val="21"/>
+              </w:rPr>
+            </w:pPr>
+            <w:r>
+              <w:rPr>
+                <w:rFonts w:hint="default" w:ascii="Arial" w:hAnsi="Arial" w:eastAsia="Segoe UI" w:cs="Arial"/>
+                <w:i w:val="0"/>
+                <w:iCs w:val="0"/>
+                <w:caps w:val="0"/>
+                <w:color w:val="000000"/>
+                <w:spacing w:val="0"/>
+                <w:sz w:val="20"/>
+                <w:szCs w:val="20"/>
+              </w:rPr>
+              <w:t>• Tạo báo cáo thử nghiệm.</w:t>
+            </w:r>
+          </w:p>
+          <w:p>
+            <w:pPr>
+              <w:pStyle w:val="4"/>
+              <w:keepNext w:val="0"/>
+              <w:keepLines w:val="0"/>
+              <w:widowControl/>
+              <w:suppressLineNumbers w:val="0"/>
+              <w:pBdr>
+                <w:top w:val="none" w:color="auto" w:sz="0" w:space="0"/>
+                <w:left w:val="none" w:color="auto" w:sz="0" w:space="0"/>
+                <w:bottom w:val="none" w:color="auto" w:sz="0" w:space="0"/>
+                <w:right w:val="none" w:color="auto" w:sz="0" w:space="0"/>
+              </w:pBdr>
+              <w:spacing w:before="40" w:beforeAutospacing="0" w:after="0" w:afterAutospacing="0" w:line="14" w:lineRule="atLeast"/>
+              <w:ind w:left="0" w:right="0"/>
+              <w:rPr>
+                <w:rFonts w:hint="default" w:ascii="Arial" w:hAnsi="Arial" w:cs="Arial"/>
+                <w:sz w:val="21"/>
+                <w:szCs w:val="21"/>
+              </w:rPr>
+            </w:pPr>
+            <w:r>
+              <w:rPr>
+                <w:rFonts w:hint="default" w:ascii="Arial" w:hAnsi="Arial" w:eastAsia="Segoe UI" w:cs="Arial"/>
+                <w:b/>
+                <w:bCs/>
+                <w:i w:val="0"/>
+                <w:iCs w:val="0"/>
+                <w:caps w:val="0"/>
+                <w:color w:val="000000"/>
+                <w:spacing w:val="0"/>
+                <w:sz w:val="20"/>
+                <w:szCs w:val="20"/>
+              </w:rPr>
+              <w:t>Sản phẩm đầu ra: tests/test_*.py; báo cáo thử nghiệm; số liệu hiệu suất.</w:t>
+            </w:r>
+          </w:p>
+        </w:tc>
+      </w:tr>
+    </w:tbl>
+    <w:p>
+      <w:pPr>
+        <w:rPr>
+          <w:rFonts w:hint="default"/>
+        </w:rPr>
+      </w:pPr>
+    </w:p>
+    <w:p>
+      <w:pPr>
+        <w:rPr>
+          <w:rFonts w:hint="default" w:ascii="Times New Roman" w:hAnsi="Times New Roman" w:cs="Times New Roman"/>
+          <w:sz w:val="26"/>
+          <w:szCs w:val="26"/>
+        </w:rPr>
+      </w:pPr>
+      <w:bookmarkStart w:id="0" w:name="_GoBack"/>
+      <w:bookmarkEnd w:id="0"/>
     </w:p>
     <w:sectPr>
       <w:pgSz w:w="11906" w:h="16838"/>
@@ -2113,7 +4314,7 @@
     <w:lsdException w:unhideWhenUsed="0" w:uiPriority="0" w:semiHidden="0" w:name="Document Map"/>
     <w:lsdException w:unhideWhenUsed="0" w:uiPriority="0" w:semiHidden="0" w:name="Plain Text"/>
     <w:lsdException w:unhideWhenUsed="0" w:uiPriority="0" w:semiHidden="0" w:name="E-mail Signature"/>
-    <w:lsdException w:unhideWhenUsed="0" w:uiPriority="0" w:semiHidden="0" w:name="Normal (Web)"/>
+    <w:lsdException w:qFormat="1" w:unhideWhenUsed="0" w:uiPriority="0" w:semiHidden="0" w:name="Normal (Web)"/>
     <w:lsdException w:unhideWhenUsed="0" w:uiPriority="0" w:semiHidden="0" w:name="HTML Acronym"/>
     <w:lsdException w:unhideWhenUsed="0" w:uiPriority="0" w:semiHidden="0" w:name="HTML Address"/>
     <w:lsdException w:unhideWhenUsed="0" w:uiPriority="0" w:semiHidden="0" w:name="HTML Cite"/>
@@ -2298,6 +4499,23 @@
         <w:right w:w="108" w:type="dxa"/>
       </w:tblCellMar>
     </w:tblPr>
+  </w:style>
+  <w:style w:type="paragraph" w:styleId="4">
+    <w:name w:val="Normal (Web)"/>
+    <w:qFormat/>
+    <w:uiPriority w:val="0"/>
+    <w:pPr>
+      <w:spacing w:before="0" w:beforeAutospacing="1" w:after="0" w:afterAutospacing="1"/>
+      <w:ind w:left="0" w:right="0"/>
+      <w:jc w:val="left"/>
+    </w:pPr>
+    <w:rPr>
+      <w:rFonts w:ascii="Times New Roman" w:hAnsi="Times New Roman" w:eastAsia="SimSun" w:cs="Times New Roman"/>
+      <w:kern w:val="0"/>
+      <w:sz w:val="24"/>
+      <w:szCs w:val="24"/>
+      <w:lang w:val="en-US" w:eastAsia="zh-CN" w:bidi="ar"/>
+    </w:rPr>
   </w:style>
 </w:styles>
 </file>

</xml_diff>

<commit_message>
cập nhật tất cả các file và sắp xếp lại
</commit_message>
<xml_diff>
--- a/DOCX/phân công.docx
+++ b/DOCX/phân công.docx
@@ -2424,35 +2424,34 @@
               <w:keepNext w:val="0"/>
               <w:keepLines w:val="0"/>
               <w:widowControl/>
-              <w:suppressLineNumbers w:val="0"/>
-              <w:pBdr>
-                <w:top w:val="none" w:color="auto" w:sz="0" w:space="0"/>
-                <w:left w:val="none" w:color="auto" w:sz="0" w:space="0"/>
-                <w:bottom w:val="none" w:color="auto" w:sz="0" w:space="0"/>
-                <w:right w:val="none" w:color="auto" w:sz="0" w:space="0"/>
-              </w:pBdr>
-              <w:spacing w:before="40" w:beforeAutospacing="0" w:after="0" w:afterAutospacing="0" w:line="14" w:lineRule="atLeast"/>
-              <w:ind w:left="0" w:right="0"/>
-              <w:rPr>
-                <w:rFonts w:hint="default" w:ascii="Arial" w:hAnsi="Arial" w:cs="Arial"/>
-                <w:sz w:val="21"/>
-                <w:szCs w:val="21"/>
-              </w:rPr>
-            </w:pPr>
-            <w:r>
-              <w:rPr>
-                <w:rFonts w:hint="default" w:ascii="Arial" w:hAnsi="Arial" w:eastAsia="Segoe UI" w:cs="Arial"/>
+              <w:pBdr>
+                <w:top w:val="none"/>
+                <w:left w:val="none"/>
+                <w:bottom w:val="none"/>
+                <w:right w:val="none"/>
+              </w:pBdr>
+              <w:suppressLineNumbers w:val="0"/>
+              <w:spacing w:before="40" w:after="0" w:line="14" w:lineRule="atLeast"/>
+              <w:ind w:left="0" w:right="0"/>
+              <w:jc w:val="left"/>
+              <w:rPr>
+                <w:rFonts w:ascii="Arial" w:hAnsi="Arial" w:cs="Arial"/>
+                <w:sz w:val="21"/>
+                <w:szCs w:val="21"/>
+              </w:rPr>
+            </w:pPr>
+            <w:r>
+              <w:rPr>
+                <w:rFonts w:ascii="Arial" w:hAnsi="Arial" w:eastAsia="Segoe UI" w:cs="Arial"/>
                 <w:b/>
                 <w:bCs/>
-                <w:i w:val="0"/>
-                <w:iCs w:val="0"/>
-                <w:caps w:val="0"/>
-                <w:color w:val="000000"/>
-                <w:spacing w:val="0"/>
+                <w:color w:val="000000"/>
+                <w:spacing w:val="0"/>
+                <w:kern w:val="0"/>
                 <w:sz w:val="20"/>
                 <w:szCs w:val="20"/>
               </w:rPr>
-              <w:t>Sản phẩm đầu ra: config.py; tài liệu quy trình; quy trình CI/CD.</w:t>
+              <w:t>Sản phẩm đầu ra: config.py; quy trình CI/CD.</w:t>
             </w:r>
           </w:p>
         </w:tc>
@@ -3438,35 +3437,34 @@
               <w:keepNext w:val="0"/>
               <w:keepLines w:val="0"/>
               <w:widowControl/>
-              <w:suppressLineNumbers w:val="0"/>
-              <w:pBdr>
-                <w:top w:val="none" w:color="auto" w:sz="0" w:space="0"/>
-                <w:left w:val="none" w:color="auto" w:sz="0" w:space="0"/>
-                <w:bottom w:val="none" w:color="auto" w:sz="0" w:space="0"/>
-                <w:right w:val="none" w:color="auto" w:sz="0" w:space="0"/>
-              </w:pBdr>
-              <w:spacing w:before="40" w:beforeAutospacing="0" w:after="0" w:afterAutospacing="0" w:line="14" w:lineRule="atLeast"/>
-              <w:ind w:left="0" w:right="0"/>
-              <w:rPr>
-                <w:rFonts w:hint="default" w:ascii="Arial" w:hAnsi="Arial" w:cs="Arial"/>
-                <w:sz w:val="21"/>
-                <w:szCs w:val="21"/>
-              </w:rPr>
-            </w:pPr>
-            <w:r>
-              <w:rPr>
-                <w:rFonts w:hint="default" w:ascii="Arial" w:hAnsi="Arial" w:eastAsia="Segoe UI" w:cs="Arial"/>
+              <w:pBdr>
+                <w:top w:val="none"/>
+                <w:left w:val="none"/>
+                <w:bottom w:val="none"/>
+                <w:right w:val="none"/>
+              </w:pBdr>
+              <w:suppressLineNumbers w:val="0"/>
+              <w:spacing w:before="40" w:after="0" w:line="14" w:lineRule="atLeast"/>
+              <w:ind w:left="0" w:right="0"/>
+              <w:jc w:val="left"/>
+              <w:rPr>
+                <w:rFonts w:ascii="Arial" w:hAnsi="Arial" w:cs="Arial"/>
+                <w:sz w:val="21"/>
+                <w:szCs w:val="21"/>
+              </w:rPr>
+            </w:pPr>
+            <w:r>
+              <w:rPr>
+                <w:rFonts w:ascii="Arial" w:hAnsi="Arial" w:eastAsia="Segoe UI" w:cs="Arial"/>
                 <w:b/>
                 <w:bCs/>
-                <w:i w:val="0"/>
-                <w:iCs w:val="0"/>
-                <w:caps w:val="0"/>
-                <w:color w:val="000000"/>
-                <w:spacing w:val="0"/>
+                <w:color w:val="000000"/>
+                <w:spacing w:val="0"/>
+                <w:kern w:val="0"/>
                 <w:sz w:val="20"/>
                 <w:szCs w:val="20"/>
               </w:rPr>
-              <w:t>Sản phẩm bàn giao: protocol.py các cải tiến; tài liệu đặc tả giao thức.</w:t>
+              <w:t xml:space="preserve">Sản phẩm bàn giao: protocol.py các cải tiến; </w:t>
             </w:r>
           </w:p>
         </w:tc>
@@ -3776,35 +3774,34 @@
               <w:keepNext w:val="0"/>
               <w:keepLines w:val="0"/>
               <w:widowControl/>
-              <w:suppressLineNumbers w:val="0"/>
-              <w:pBdr>
-                <w:top w:val="none" w:color="auto" w:sz="0" w:space="0"/>
-                <w:left w:val="none" w:color="auto" w:sz="0" w:space="0"/>
-                <w:bottom w:val="none" w:color="auto" w:sz="0" w:space="0"/>
-                <w:right w:val="none" w:color="auto" w:sz="0" w:space="0"/>
-              </w:pBdr>
-              <w:spacing w:before="40" w:beforeAutospacing="0" w:after="0" w:afterAutospacing="0" w:line="14" w:lineRule="atLeast"/>
-              <w:ind w:left="0" w:right="0"/>
-              <w:rPr>
-                <w:rFonts w:hint="default" w:ascii="Arial" w:hAnsi="Arial" w:cs="Arial"/>
-                <w:sz w:val="21"/>
-                <w:szCs w:val="21"/>
-              </w:rPr>
-            </w:pPr>
-            <w:r>
-              <w:rPr>
-                <w:rFonts w:hint="default" w:ascii="Arial" w:hAnsi="Arial" w:eastAsia="Segoe UI" w:cs="Arial"/>
+              <w:pBdr>
+                <w:top w:val="none"/>
+                <w:left w:val="none"/>
+                <w:bottom w:val="none"/>
+                <w:right w:val="none"/>
+              </w:pBdr>
+              <w:suppressLineNumbers w:val="0"/>
+              <w:spacing w:before="40" w:after="0" w:line="14" w:lineRule="atLeast"/>
+              <w:ind w:left="0" w:right="0"/>
+              <w:jc w:val="left"/>
+              <w:rPr>
+                <w:rFonts w:ascii="Arial" w:hAnsi="Arial" w:cs="Arial"/>
+                <w:sz w:val="21"/>
+                <w:szCs w:val="21"/>
+              </w:rPr>
+            </w:pPr>
+            <w:r>
+              <w:rPr>
+                <w:rFonts w:ascii="Arial" w:hAnsi="Arial" w:eastAsia="Segoe UI" w:cs="Arial"/>
                 <w:b/>
                 <w:bCs/>
-                <w:i w:val="0"/>
-                <w:iCs w:val="0"/>
-                <w:caps w:val="0"/>
-                <w:color w:val="000000"/>
-                <w:spacing w:val="0"/>
+                <w:color w:val="000000"/>
+                <w:spacing w:val="0"/>
+                <w:kern w:val="0"/>
                 <w:sz w:val="20"/>
                 <w:szCs w:val="20"/>
               </w:rPr>
-              <w:t>Sản phẩm đầu ra: handshake.py được cải tiến; tài liệu đánh giá bảo mật.</w:t>
+              <w:t xml:space="preserve">Sản phẩm đầu ra: handshake.py được cải tiến; </w:t>
             </w:r>
           </w:p>
         </w:tc>
@@ -4149,35 +4146,34 @@
               <w:keepNext w:val="0"/>
               <w:keepLines w:val="0"/>
               <w:widowControl/>
-              <w:suppressLineNumbers w:val="0"/>
-              <w:pBdr>
-                <w:top w:val="none" w:color="auto" w:sz="0" w:space="0"/>
-                <w:left w:val="none" w:color="auto" w:sz="0" w:space="0"/>
-                <w:bottom w:val="none" w:color="auto" w:sz="0" w:space="0"/>
-                <w:right w:val="none" w:color="auto" w:sz="0" w:space="0"/>
-              </w:pBdr>
-              <w:spacing w:before="40" w:beforeAutospacing="0" w:after="0" w:afterAutospacing="0" w:line="14" w:lineRule="atLeast"/>
-              <w:ind w:left="0" w:right="0"/>
-              <w:rPr>
-                <w:rFonts w:hint="default" w:ascii="Arial" w:hAnsi="Arial" w:cs="Arial"/>
-                <w:sz w:val="21"/>
-                <w:szCs w:val="21"/>
-              </w:rPr>
-            </w:pPr>
-            <w:r>
-              <w:rPr>
-                <w:rFonts w:hint="default" w:ascii="Arial" w:hAnsi="Arial" w:eastAsia="Segoe UI" w:cs="Arial"/>
+              <w:pBdr>
+                <w:top w:val="none"/>
+                <w:left w:val="none"/>
+                <w:bottom w:val="none"/>
+                <w:right w:val="none"/>
+              </w:pBdr>
+              <w:suppressLineNumbers w:val="0"/>
+              <w:spacing w:before="40" w:after="0" w:line="14" w:lineRule="atLeast"/>
+              <w:ind w:left="0" w:right="0"/>
+              <w:jc w:val="left"/>
+              <w:rPr>
+                <w:rFonts w:ascii="Arial" w:hAnsi="Arial" w:cs="Arial"/>
+                <w:sz w:val="21"/>
+                <w:szCs w:val="21"/>
+              </w:rPr>
+            </w:pPr>
+            <w:r>
+              <w:rPr>
+                <w:rFonts w:ascii="Arial" w:hAnsi="Arial" w:eastAsia="Segoe UI" w:cs="Arial"/>
                 <w:b/>
                 <w:bCs/>
-                <w:i w:val="0"/>
-                <w:iCs w:val="0"/>
-                <w:caps w:val="0"/>
-                <w:color w:val="000000"/>
-                <w:spacing w:val="0"/>
+                <w:color w:val="000000"/>
+                <w:spacing w:val="0"/>
+                <w:kern w:val="0"/>
                 <w:sz w:val="20"/>
                 <w:szCs w:val="20"/>
               </w:rPr>
-              <w:t>Sản phẩm đầu ra: tests/test_*.py; báo cáo thử nghiệm; số liệu hiệu suất.</w:t>
+              <w:t xml:space="preserve">Sản phẩm đầu ra: tests/test_*.py; báo cáo thử nghiệm; </w:t>
             </w:r>
           </w:p>
         </w:tc>

</xml_diff>